<commit_message>
final(G1): Change Request + Impact + Trace
</commit_message>
<xml_diff>
--- a/final-exam/ENGSE206_Final_PartA_GroupAnswer_Template_v1.0.docx
+++ b/final-exam/ENGSE206_Final_PartA_GroupAnswer_Template_v1.0.docx
@@ -559,10 +559,11 @@
           <w:insideH w:val="single" w:sz="4" w:color="auto"/>
           <w:insideV w:val="single" w:sz="4" w:color="auto"/>
         </w:tblBorders>
+        <w:tblLayout w:type="fixed"/>
       </w:tblPr>
       <w:tblGrid>
-        <w:gridCol w:w="2120"/>
-        <w:gridCol w:w="7518"/>
+        <w:gridCol w:w="1850"/>
+        <w:gridCol w:w="7788"/>
       </w:tblGrid>
       <w:tr>
         <w:trPr>
@@ -570,7 +571,7 @@
         </w:trPr>
         <w:tc>
           <w:tcPr>
-            <w:tcW w:w="9638" w:type="dxa"/>
+            <w:tcW w:w="1850" w:type="dxa"/>
             <w:gridSpan w:val="2"/>
             <w:tcBorders>
               <w:top w:val="single" w:sz="4" w:color="173B65"/>
@@ -634,7 +635,7 @@
         </w:trPr>
         <w:tc>
           <w:tcPr>
-            <w:tcW w:w="2120" w:type="dxa"/>
+            <w:tcW w:w="1850" w:type="dxa"/>
             <w:tcBorders>
               <w:top w:val="single" w:sz="4" w:color="B9CCDD"/>
               <w:left w:val="single" w:sz="4" w:color="B9CCDD"/>
@@ -669,7 +670,7 @@
         </w:tc>
         <w:tc>
           <w:tcPr>
-            <w:tcW w:w="7518" w:type="dxa"/>
+            <w:tcW w:w="7788" w:type="dxa"/>
             <w:tcBorders>
               <w:top w:val="single" w:sz="4" w:color="B9CCDD"/>
               <w:left w:val="single" w:sz="4" w:color="B9CCDD"/>
@@ -690,15 +691,111 @@
             </w:pPr>
             <w:r>
               <w:rPr>
-                <w:rFonts w:ascii="TH Sarabun New" w:hAnsi="TH Sarabun New" w:eastAsia="TH Sarabun New" w:cs="TH Sarabun New"/>
-                <w:b w:val="0"/>
-                <w:bCs w:val="0"/>
-                <w:i w:val="0"/>
-                <w:iCs w:val="0"/>
-                <w:color w:val="5A6B7C"/>
-                <w:sz w:val="28"/>
-                <w:szCs w:val="28"/>
-              </w:rPr>
+                <w:rFonts w:ascii="TH Sarabun New" w:hAnsi="TH Sarabun New" w:cs="TH Sarabun New"/>
+                <w:color w:val="172333"/>
+                <w:sz w:val="28"/>
+                <w:szCs w:val="28"/>
+              </w:rPr>
+              <w:t xml:space="preserve">1. แจ้งลูกค้าเมื่อสถานะออเดอร์เปลี่ยน (ออเดอร์ใหม่ =&gt; กำลังทำ =&gt; พร้อมรับ =&gt; รับแล้ว / ยกเลิก) </w:t>
+            </w:r>
+          </w:p>
+          <w:p>
+            <w:pPr>
+              <w:keepNext/>
+              <w:keepLines/>
+            </w:pPr>
+            <w:r>
+              <w:rPr>
+                <w:rFonts w:ascii="TH Sarabun New" w:hAnsi="TH Sarabun New" w:cs="TH Sarabun New"/>
+                <w:color w:val="172333"/>
+                <w:sz w:val="28"/>
+                <w:szCs w:val="28"/>
+              </w:rPr>
+              <w:t xml:space="preserve">2. เตือนเองเมื่อออเดอร์ค้างเกินเวลาที่กำหนด </w:t>
+            </w:r>
+          </w:p>
+          <w:p>
+            <w:r>
+              <w:rPr>
+                <w:rFonts w:ascii="TH Sarabun New" w:hAnsi="TH Sarabun New" w:cs="TH Sarabun New"/>
+                <w:color w:val="172333"/>
+                <w:sz w:val="28"/>
+                <w:szCs w:val="28"/>
+              </w:rPr>
+              <w:t>3. ลูกค้าเลือก opt-in รับแจ้งผ่านช่องทางภายนอก และข้อความมีข้อมูลส่วนบุคคลเท่าที่จำเป็น</w:t>
+            </w:r>
+          </w:p>
+        </w:tc>
+      </w:tr>
+      <w:tr>
+        <w:trPr>
+          <w:cantSplit/>
+          <w:trHeight w:val="552" w:hRule="atLeast"/>
+        </w:trPr>
+        <w:tc>
+          <w:tcPr>
+            <w:tcW w:w="1850" w:type="dxa"/>
+            <w:tcBorders>
+              <w:top w:val="single" w:sz="4" w:color="B9CCDD"/>
+              <w:left w:val="single" w:sz="4" w:color="B9CCDD"/>
+              <w:bottom w:val="single" w:sz="4" w:color="B9CCDD"/>
+              <w:right w:val="single" w:sz="4" w:color="B9CCDD"/>
+            </w:tcBorders>
+            <w:shd w:val="clear" w:fill="E3EEF6"/>
+            <w:tcMar>
+              <w:top w:w="40" w:type="dxa"/>
+              <w:left w:w="110" w:type="dxa"/>
+              <w:bottom w:w="40" w:type="dxa"/>
+              <w:right w:w="90" w:type="dxa"/>
+            </w:tcMar>
+          </w:tcPr>
+          <w:p>
+            <w:pPr>
+              <w:keepNext/>
+              <w:keepLines/>
+            </w:pPr>
+            <w:r>
+              <w:rPr>
+                <w:rFonts w:ascii="TH Sarabun New" w:hAnsi="TH Sarabun New" w:eastAsia="TH Sarabun New" w:cs="TH Sarabun New"/>
+                <w:b/>
+                <w:bCs/>
+                <w:color w:val="173B65"/>
+                <w:sz w:val="28"/>
+                <w:szCs w:val="28"/>
+              </w:rPr>
+              <w:t>เหตุผลที่ผู้เสนออ้าง</w:t>
+            </w:r>
+          </w:p>
+        </w:tc>
+        <w:tc>
+          <w:tcPr>
+            <w:tcW w:w="7788" w:type="dxa"/>
+            <w:tcBorders>
+              <w:top w:val="single" w:sz="4" w:color="B9CCDD"/>
+              <w:left w:val="single" w:sz="4" w:color="B9CCDD"/>
+              <w:bottom w:val="single" w:sz="4" w:color="B9CCDD"/>
+              <w:right w:val="single" w:sz="4" w:color="B9CCDD"/>
+            </w:tcBorders>
+            <w:tcMar>
+              <w:top w:w="40" w:type="dxa"/>
+              <w:left w:w="110" w:type="dxa"/>
+              <w:bottom w:w="40" w:type="dxa"/>
+              <w:right w:w="90" w:type="dxa"/>
+            </w:tcMar>
+          </w:tcPr>
+          <w:p>
+            <w:pPr>
+              <w:keepNext/>
+              <w:keepLines/>
+            </w:pPr>
+            <w:r>
+              <w:rPr>
+                <w:rFonts w:ascii="TH Sarabun New" w:hAnsi="TH Sarabun New" w:cs="TH Sarabun New"/>
+                <w:color w:val="172333"/>
+                <w:sz w:val="28"/>
+                <w:szCs w:val="28"/>
+              </w:rPr>
+              <w:t>เจ้าของร้านต้องการให้ลูกค้ารู้สถานะออเดอร์ และให้ระบบเตือนรายการที่ค้างเอง แต่ยังไม่กำหนดช่องทางแจ้งเตือนหรือเวลาที่ใช้ตัดสินว่าออเดอร์ค้าง</w:t>
             </w:r>
           </w:p>
         </w:tc>
@@ -710,7 +807,7 @@
         </w:trPr>
         <w:tc>
           <w:tcPr>
-            <w:tcW w:w="2120" w:type="dxa"/>
+            <w:tcW w:w="1850" w:type="dxa"/>
             <w:tcBorders>
               <w:top w:val="single" w:sz="4" w:color="B9CCDD"/>
               <w:left w:val="single" w:sz="4" w:color="B9CCDD"/>
@@ -739,13 +836,13 @@
                 <w:sz w:val="28"/>
                 <w:szCs w:val="28"/>
               </w:rPr>
-              <w:t>เหตุผลที่ผู้เสนออ้าง</w:t>
-            </w:r>
-          </w:p>
-        </w:tc>
-        <w:tc>
-          <w:tcPr>
-            <w:tcW w:w="7518" w:type="dxa"/>
+              <w:t>กระทบข้อกำหนด (ID)</w:t>
+            </w:r>
+          </w:p>
+        </w:tc>
+        <w:tc>
+          <w:tcPr>
+            <w:tcW w:w="7788" w:type="dxa"/>
             <w:tcBorders>
               <w:top w:val="single" w:sz="4" w:color="B9CCDD"/>
               <w:left w:val="single" w:sz="4" w:color="B9CCDD"/>
@@ -766,15 +863,12 @@
             </w:pPr>
             <w:r>
               <w:rPr>
-                <w:rFonts w:ascii="TH Sarabun New" w:hAnsi="TH Sarabun New" w:eastAsia="TH Sarabun New" w:cs="TH Sarabun New"/>
-                <w:b w:val="0"/>
-                <w:bCs w:val="0"/>
-                <w:i w:val="0"/>
-                <w:iCs w:val="0"/>
-                <w:color w:val="5A6B7C"/>
-                <w:sz w:val="28"/>
-                <w:szCs w:val="28"/>
-              </w:rPr>
+                <w:rFonts w:ascii="TH Sarabun New" w:hAnsi="TH Sarabun New" w:cs="TH Sarabun New"/>
+                <w:color w:val="172333"/>
+                <w:sz w:val="28"/>
+                <w:szCs w:val="28"/>
+              </w:rPr>
+              <w:t>แก้ FR-01 เพิ่ม FR-07, FR-08, BR-02 และเสนอ NFR-04 ใหม่</w:t>
             </w:r>
           </w:p>
         </w:tc>
@@ -786,7 +880,7 @@
         </w:trPr>
         <w:tc>
           <w:tcPr>
-            <w:tcW w:w="2120" w:type="dxa"/>
+            <w:tcW w:w="1850" w:type="dxa"/>
             <w:tcBorders>
               <w:top w:val="single" w:sz="4" w:color="B9CCDD"/>
               <w:left w:val="single" w:sz="4" w:color="B9CCDD"/>
@@ -815,13 +909,13 @@
                 <w:sz w:val="28"/>
                 <w:szCs w:val="28"/>
               </w:rPr>
-              <w:t>กระทบข้อกำหนด (ID)</w:t>
-            </w:r>
-          </w:p>
-        </w:tc>
-        <w:tc>
-          <w:tcPr>
-            <w:tcW w:w="7518" w:type="dxa"/>
+              <w:t>กระทบ model และ trace</w:t>
+            </w:r>
+          </w:p>
+        </w:tc>
+        <w:tc>
+          <w:tcPr>
+            <w:tcW w:w="7788" w:type="dxa"/>
             <w:tcBorders>
               <w:top w:val="single" w:sz="4" w:color="B9CCDD"/>
               <w:left w:val="single" w:sz="4" w:color="B9CCDD"/>
@@ -842,15 +936,12 @@
             </w:pPr>
             <w:r>
               <w:rPr>
-                <w:rFonts w:ascii="TH Sarabun New" w:hAnsi="TH Sarabun New" w:eastAsia="TH Sarabun New" w:cs="TH Sarabun New"/>
-                <w:b w:val="0"/>
-                <w:bCs w:val="0"/>
-                <w:i w:val="0"/>
-                <w:iCs w:val="0"/>
-                <w:color w:val="5A6B7C"/>
-                <w:sz w:val="28"/>
-                <w:szCs w:val="28"/>
-              </w:rPr>
+                <w:rFonts w:ascii="TH Sarabun New" w:hAnsi="TH Sarabun New" w:cs="TH Sarabun New"/>
+                <w:color w:val="172333"/>
+                <w:sz w:val="28"/>
+                <w:szCs w:val="28"/>
+              </w:rPr>
+              <w:t xml:space="preserve">US-01 (ต้องแก้), US-12/US-13 (เพิ่มใหม่) และ  AC-01 (ต้องแก้), AC-06–AC-09 (ใหม่)</w:t>
             </w:r>
           </w:p>
         </w:tc>
@@ -862,7 +953,7 @@
         </w:trPr>
         <w:tc>
           <w:tcPr>
-            <w:tcW w:w="2120" w:type="dxa"/>
+            <w:tcW w:w="1850" w:type="dxa"/>
             <w:tcBorders>
               <w:top w:val="single" w:sz="4" w:color="B9CCDD"/>
               <w:left w:val="single" w:sz="4" w:color="B9CCDD"/>
@@ -891,13 +982,13 @@
                 <w:sz w:val="28"/>
                 <w:szCs w:val="28"/>
               </w:rPr>
-              <w:t>กระทบ model และ trace</w:t>
-            </w:r>
-          </w:p>
-        </w:tc>
-        <w:tc>
-          <w:tcPr>
-            <w:tcW w:w="7518" w:type="dxa"/>
+              <w:t>กระทบการออกแบบ / ทดสอบ</w:t>
+            </w:r>
+          </w:p>
+        </w:tc>
+        <w:tc>
+          <w:tcPr>
+            <w:tcW w:w="7788" w:type="dxa"/>
             <w:tcBorders>
               <w:top w:val="single" w:sz="4" w:color="B9CCDD"/>
               <w:left w:val="single" w:sz="4" w:color="B9CCDD"/>
@@ -918,15 +1009,12 @@
             </w:pPr>
             <w:r>
               <w:rPr>
-                <w:rFonts w:ascii="TH Sarabun New" w:hAnsi="TH Sarabun New" w:eastAsia="TH Sarabun New" w:cs="TH Sarabun New"/>
-                <w:b w:val="0"/>
-                <w:bCs w:val="0"/>
-                <w:i w:val="0"/>
-                <w:iCs w:val="0"/>
-                <w:color w:val="5A6B7C"/>
-                <w:sz w:val="28"/>
-                <w:szCs w:val="28"/>
-              </w:rPr>
+                <w:rFonts w:ascii="TH Sarabun New" w:hAnsi="TH Sarabun New" w:cs="TH Sarabun New"/>
+                <w:color w:val="172333"/>
+                <w:sz w:val="28"/>
+                <w:szCs w:val="28"/>
+              </w:rPr>
+              <w:t>API ต้องบันทึกสถานะก่อนส่งแจ้งเตือน เพิ่มให้เรียก API ตรวจออเดอร์ค้าง ทดสอบว่าระบบแจ้งถูกคนและตรวจสถานะ/เวลาค้างได้ถูกต้อง (เวลายังเป็น TBD)</w:t>
             </w:r>
           </w:p>
         </w:tc>
@@ -938,7 +1026,7 @@
         </w:trPr>
         <w:tc>
           <w:tcPr>
-            <w:tcW w:w="2120" w:type="dxa"/>
+            <w:tcW w:w="1850" w:type="dxa"/>
             <w:tcBorders>
               <w:top w:val="single" w:sz="4" w:color="B9CCDD"/>
               <w:left w:val="single" w:sz="4" w:color="B9CCDD"/>
@@ -967,13 +1055,13 @@
                 <w:sz w:val="28"/>
                 <w:szCs w:val="28"/>
               </w:rPr>
-              <w:t>กระทบการออกแบบ / ทดสอบ</w:t>
-            </w:r>
-          </w:p>
-        </w:tc>
-        <w:tc>
-          <w:tcPr>
-            <w:tcW w:w="7518" w:type="dxa"/>
+              <w:t>ทางเลือก (≥ 2)</w:t>
+            </w:r>
+          </w:p>
+        </w:tc>
+        <w:tc>
+          <w:tcPr>
+            <w:tcW w:w="7788" w:type="dxa"/>
             <w:tcBorders>
               <w:top w:val="single" w:sz="4" w:color="B9CCDD"/>
               <w:left w:val="single" w:sz="4" w:color="B9CCDD"/>
@@ -994,15 +1082,27 @@
             </w:pPr>
             <w:r>
               <w:rPr>
-                <w:rFonts w:ascii="TH Sarabun New" w:hAnsi="TH Sarabun New" w:eastAsia="TH Sarabun New" w:cs="TH Sarabun New"/>
-                <w:b w:val="0"/>
-                <w:bCs w:val="0"/>
-                <w:i w:val="0"/>
-                <w:iCs w:val="0"/>
-                <w:color w:val="5A6B7C"/>
-                <w:sz w:val="28"/>
-                <w:szCs w:val="28"/>
-              </w:rPr>
+                <w:rFonts w:ascii="TH Sarabun New" w:hAnsi="TH Sarabun New" w:cs="TH Sarabun New"/>
+                <w:color w:val="172333"/>
+                <w:sz w:val="28"/>
+                <w:szCs w:val="28"/>
+              </w:rPr>
+              <w:t>1. แจ้งเมื่อสถานะเปลี่ยนและเตือนออเดอร์ค้าง โดยให้ API เลือกลูกค้าจากออเดอร์</w:t>
+            </w:r>
+          </w:p>
+          <w:p>
+            <w:pPr>
+              <w:keepNext/>
+              <w:keepLines/>
+            </w:pPr>
+            <w:r>
+              <w:rPr>
+                <w:rFonts w:ascii="TH Sarabun New" w:hAnsi="TH Sarabun New" w:cs="TH Sarabun New"/>
+                <w:color w:val="172333"/>
+                <w:sz w:val="28"/>
+                <w:szCs w:val="28"/>
+              </w:rPr>
+              <w:t>2. ทำตามคำขอทั้ง 3 ส่วน รวม opt-in และข้อกำหนดข้อมูลในข้อความ</w:t>
             </w:r>
           </w:p>
         </w:tc>
@@ -1014,7 +1114,7 @@
         </w:trPr>
         <w:tc>
           <w:tcPr>
-            <w:tcW w:w="2120" w:type="dxa"/>
+            <w:tcW w:w="1850" w:type="dxa"/>
             <w:tcBorders>
               <w:top w:val="single" w:sz="4" w:color="B9CCDD"/>
               <w:left w:val="single" w:sz="4" w:color="B9CCDD"/>
@@ -1043,13 +1143,13 @@
                 <w:sz w:val="28"/>
                 <w:szCs w:val="28"/>
               </w:rPr>
-              <w:t>ทางเลือก (≥ 2)</w:t>
-            </w:r>
-          </w:p>
-        </w:tc>
-        <w:tc>
-          <w:tcPr>
-            <w:tcW w:w="7518" w:type="dxa"/>
+              <w:t>Decision ที่กลุ่มเสนอ + ใครมีอำนาจตัดสิน</w:t>
+            </w:r>
+          </w:p>
+        </w:tc>
+        <w:tc>
+          <w:tcPr>
+            <w:tcW w:w="7788" w:type="dxa"/>
             <w:tcBorders>
               <w:top w:val="single" w:sz="4" w:color="B9CCDD"/>
               <w:left w:val="single" w:sz="4" w:color="B9CCDD"/>
@@ -1070,15 +1170,12 @@
             </w:pPr>
             <w:r>
               <w:rPr>
-                <w:rFonts w:ascii="TH Sarabun New" w:hAnsi="TH Sarabun New" w:eastAsia="TH Sarabun New" w:cs="TH Sarabun New"/>
-                <w:b w:val="0"/>
-                <w:bCs w:val="0"/>
-                <w:i w:val="0"/>
-                <w:iCs w:val="0"/>
-                <w:color w:val="5A6B7C"/>
-                <w:sz w:val="28"/>
-                <w:szCs w:val="28"/>
-              </w:rPr>
+                <w:rFonts w:ascii="TH Sarabun New" w:hAnsi="TH Sarabun New" w:cs="TH Sarabun New"/>
+                <w:color w:val="172333"/>
+                <w:sz w:val="28"/>
+                <w:szCs w:val="28"/>
+              </w:rPr>
+              <w:t>เสนอ 1. ทำความสามารถแรกก่อน ตัด opt-in และข้อกำหนดข้อมูลในข้อความออกจาก scope รุ่นนี้</w:t>
             </w:r>
           </w:p>
         </w:tc>
@@ -1090,7 +1187,7 @@
         </w:trPr>
         <w:tc>
           <w:tcPr>
-            <w:tcW w:w="2120" w:type="dxa"/>
+            <w:tcW w:w="1850" w:type="dxa"/>
             <w:tcBorders>
               <w:top w:val="single" w:sz="4" w:color="B9CCDD"/>
               <w:left w:val="single" w:sz="4" w:color="B9CCDD"/>
@@ -1107,7 +1204,7 @@
           </w:tcPr>
           <w:p>
             <w:pPr>
-              <w:keepNext/>
+              <w:keepNext w:val="0"/>
               <w:keepLines/>
             </w:pPr>
             <w:r>
@@ -1119,13 +1216,13 @@
                 <w:sz w:val="28"/>
                 <w:szCs w:val="28"/>
               </w:rPr>
-              <w:t>Decision ที่กลุ่มเสนอ + ใครมีอำนาจตัดสิน</w:t>
-            </w:r>
-          </w:p>
-        </w:tc>
-        <w:tc>
-          <w:tcPr>
-            <w:tcW w:w="7518" w:type="dxa"/>
+              <w:t>Next action</w:t>
+            </w:r>
+          </w:p>
+        </w:tc>
+        <w:tc>
+          <w:tcPr>
+            <w:tcW w:w="7788" w:type="dxa"/>
             <w:tcBorders>
               <w:top w:val="single" w:sz="4" w:color="B9CCDD"/>
               <w:left w:val="single" w:sz="4" w:color="B9CCDD"/>
@@ -1141,96 +1238,17 @@
           </w:tcPr>
           <w:p>
             <w:pPr>
-              <w:keepNext/>
-              <w:keepLines/>
-            </w:pPr>
-            <w:r>
-              <w:rPr>
-                <w:rFonts w:ascii="TH Sarabun New" w:hAnsi="TH Sarabun New" w:eastAsia="TH Sarabun New" w:cs="TH Sarabun New"/>
-                <w:b w:val="0"/>
-                <w:bCs w:val="0"/>
-                <w:i w:val="0"/>
-                <w:iCs w:val="0"/>
-                <w:color w:val="5A6B7C"/>
-                <w:sz w:val="28"/>
-                <w:szCs w:val="28"/>
-              </w:rPr>
-            </w:r>
-          </w:p>
-        </w:tc>
-      </w:tr>
-      <w:tr>
-        <w:trPr>
-          <w:cantSplit/>
-          <w:trHeight w:val="567" w:hRule="atLeast"/>
-        </w:trPr>
-        <w:tc>
-          <w:tcPr>
-            <w:tcW w:w="2120" w:type="dxa"/>
-            <w:tcBorders>
-              <w:top w:val="single" w:sz="4" w:color="B9CCDD"/>
-              <w:left w:val="single" w:sz="4" w:color="B9CCDD"/>
-              <w:bottom w:val="single" w:sz="4" w:color="B9CCDD"/>
-              <w:right w:val="single" w:sz="4" w:color="B9CCDD"/>
-            </w:tcBorders>
-            <w:shd w:val="clear" w:fill="E3EEF6"/>
-            <w:tcMar>
-              <w:top w:w="40" w:type="dxa"/>
-              <w:left w:w="110" w:type="dxa"/>
-              <w:bottom w:w="40" w:type="dxa"/>
-              <w:right w:w="90" w:type="dxa"/>
-            </w:tcMar>
-          </w:tcPr>
-          <w:p>
-            <w:pPr>
               <w:keepNext w:val="0"/>
               <w:keepLines/>
             </w:pPr>
             <w:r>
               <w:rPr>
-                <w:rFonts w:ascii="TH Sarabun New" w:hAnsi="TH Sarabun New" w:eastAsia="TH Sarabun New" w:cs="TH Sarabun New"/>
-                <w:b/>
-                <w:bCs/>
-                <w:color w:val="173B65"/>
-                <w:sz w:val="28"/>
-                <w:szCs w:val="28"/>
-              </w:rPr>
-              <w:t>Next action</w:t>
-            </w:r>
-          </w:p>
-        </w:tc>
-        <w:tc>
-          <w:tcPr>
-            <w:tcW w:w="7518" w:type="dxa"/>
-            <w:tcBorders>
-              <w:top w:val="single" w:sz="4" w:color="B9CCDD"/>
-              <w:left w:val="single" w:sz="4" w:color="B9CCDD"/>
-              <w:bottom w:val="single" w:sz="4" w:color="B9CCDD"/>
-              <w:right w:val="single" w:sz="4" w:color="B9CCDD"/>
-            </w:tcBorders>
-            <w:tcMar>
-              <w:top w:w="40" w:type="dxa"/>
-              <w:left w:w="110" w:type="dxa"/>
-              <w:bottom w:w="40" w:type="dxa"/>
-              <w:right w:w="90" w:type="dxa"/>
-            </w:tcMar>
-          </w:tcPr>
-          <w:p>
-            <w:pPr>
-              <w:keepNext w:val="0"/>
-              <w:keepLines/>
-            </w:pPr>
-            <w:r>
-              <w:rPr>
-                <w:rFonts w:ascii="TH Sarabun New" w:hAnsi="TH Sarabun New" w:eastAsia="TH Sarabun New" w:cs="TH Sarabun New"/>
-                <w:b w:val="0"/>
-                <w:bCs w:val="0"/>
-                <w:i w:val="0"/>
-                <w:iCs w:val="0"/>
-                <w:color w:val="5A6B7C"/>
-                <w:sz w:val="28"/>
-                <w:szCs w:val="28"/>
-              </w:rPr>
+                <w:rFonts w:ascii="TH Sarabun New" w:hAnsi="TH Sarabun New" w:cs="TH Sarabun New"/>
+                <w:color w:val="172333"/>
+                <w:sz w:val="28"/>
+                <w:szCs w:val="28"/>
+              </w:rPr>
+              <w:t>ให้เจ้าของระบบยืนยันช่องทางแจ้งเตือน วิธีเชื่อมต่อ เวลาที่ถือว่าค้าง รอบตรวจ และผู้รับเมื่อออเดอร์ค้าง</w:t>
             </w:r>
           </w:p>
         </w:tc>
@@ -1291,6 +1309,7 @@
           <w:insideH w:val="single" w:sz="4" w:color="auto"/>
           <w:insideV w:val="single" w:sz="4" w:color="auto"/>
         </w:tblBorders>
+        <w:tblLayout w:type="fixed"/>
       </w:tblPr>
       <w:tblGrid>
         <w:gridCol w:w="481"/>
@@ -1593,209 +1612,126 @@
           <w:tcPr>
             <w:tcW w:w="1638" w:type="dxa"/>
             <w:tcBorders>
-              <w:top w:val="single" w:sz="4" w:color="C9D3DC"/>
-              <w:left w:val="single" w:sz="4" w:color="C9D3DC"/>
-              <w:bottom w:val="single" w:sz="4" w:color="C9D3DC"/>
-              <w:right w:val="single" w:sz="4" w:color="C9D3DC"/>
-            </w:tcBorders>
-            <w:shd w:val="clear" w:fill="FFFFFF"/>
-            <w:tcMar>
-              <w:top w:w="40" w:type="dxa"/>
-              <w:left w:w="90" w:type="dxa"/>
-              <w:bottom w:w="40" w:type="dxa"/>
-              <w:right w:w="90" w:type="dxa"/>
-            </w:tcMar>
-          </w:tcPr>
-          <w:p>
-            <w:pPr>
-              <w:keepNext/>
-            </w:pPr>
-            <w:r>
-              <w:rPr>
-                <w:rFonts w:ascii="TH Sarabun New" w:hAnsi="TH Sarabun New" w:eastAsia="TH Sarabun New" w:cs="TH Sarabun New"/>
-                <w:b w:val="0"/>
-                <w:bCs w:val="0"/>
-                <w:i w:val="0"/>
-                <w:iCs w:val="0"/>
-                <w:color w:val="172333"/>
-                <w:sz w:val="28"/>
-                <w:szCs w:val="28"/>
-              </w:rPr>
-            </w:r>
-          </w:p>
-        </w:tc>
-        <w:tc>
-          <w:tcPr>
-            <w:tcW w:w="1638" w:type="dxa"/>
-            <w:tcBorders>
-              <w:top w:val="single" w:sz="4" w:color="C9D3DC"/>
-              <w:left w:val="single" w:sz="4" w:color="C9D3DC"/>
-              <w:bottom w:val="single" w:sz="4" w:color="C9D3DC"/>
-              <w:right w:val="single" w:sz="4" w:color="C9D3DC"/>
-            </w:tcBorders>
-            <w:shd w:val="clear" w:fill="FFFFFF"/>
-            <w:tcMar>
-              <w:top w:w="40" w:type="dxa"/>
-              <w:left w:w="90" w:type="dxa"/>
-              <w:bottom w:w="40" w:type="dxa"/>
-              <w:right w:w="90" w:type="dxa"/>
-            </w:tcMar>
-          </w:tcPr>
-          <w:p>
-            <w:pPr>
-              <w:keepNext/>
-            </w:pPr>
-            <w:r>
-              <w:rPr>
-                <w:rFonts w:ascii="TH Sarabun New" w:hAnsi="TH Sarabun New" w:eastAsia="TH Sarabun New" w:cs="TH Sarabun New"/>
-                <w:b w:val="0"/>
-                <w:bCs w:val="0"/>
-                <w:i w:val="0"/>
-                <w:iCs w:val="0"/>
-                <w:color w:val="172333"/>
-                <w:sz w:val="28"/>
-                <w:szCs w:val="28"/>
-              </w:rPr>
-            </w:r>
-          </w:p>
-        </w:tc>
-        <w:tc>
-          <w:tcPr>
-            <w:tcW w:w="1542" w:type="dxa"/>
-            <w:tcBorders>
-              <w:top w:val="single" w:sz="4" w:color="C9D3DC"/>
-              <w:left w:val="single" w:sz="4" w:color="C9D3DC"/>
-              <w:bottom w:val="single" w:sz="4" w:color="C9D3DC"/>
-              <w:right w:val="single" w:sz="4" w:color="C9D3DC"/>
-            </w:tcBorders>
-            <w:shd w:val="clear" w:fill="FFFFFF"/>
-            <w:tcMar>
-              <w:top w:w="40" w:type="dxa"/>
-              <w:left w:w="90" w:type="dxa"/>
-              <w:bottom w:w="40" w:type="dxa"/>
-              <w:right w:w="90" w:type="dxa"/>
-            </w:tcMar>
-          </w:tcPr>
-          <w:p>
-            <w:pPr>
-              <w:keepNext/>
-            </w:pPr>
-            <w:r>
-              <w:rPr>
-                <w:rFonts w:ascii="TH Sarabun New" w:hAnsi="TH Sarabun New" w:eastAsia="TH Sarabun New" w:cs="TH Sarabun New"/>
-                <w:b w:val="0"/>
-                <w:bCs w:val="0"/>
-                <w:i w:val="0"/>
-                <w:iCs w:val="0"/>
-                <w:color w:val="172333"/>
-                <w:sz w:val="28"/>
-                <w:szCs w:val="28"/>
-              </w:rPr>
-            </w:r>
-          </w:p>
-        </w:tc>
-        <w:tc>
-          <w:tcPr>
-            <w:tcW w:w="1156" w:type="dxa"/>
-            <w:tcBorders>
-              <w:top w:val="single" w:sz="4" w:color="C9D3DC"/>
-              <w:left w:val="single" w:sz="4" w:color="C9D3DC"/>
-              <w:bottom w:val="single" w:sz="4" w:color="C9D3DC"/>
-              <w:right w:val="single" w:sz="4" w:color="C9D3DC"/>
-            </w:tcBorders>
-            <w:shd w:val="clear" w:fill="FFFFFF"/>
-            <w:tcMar>
-              <w:top w:w="40" w:type="dxa"/>
-              <w:left w:w="90" w:type="dxa"/>
-              <w:bottom w:w="40" w:type="dxa"/>
-              <w:right w:w="90" w:type="dxa"/>
-            </w:tcMar>
-          </w:tcPr>
-          <w:p>
-            <w:pPr>
-              <w:keepNext/>
-            </w:pPr>
-            <w:r>
-              <w:rPr>
-                <w:rFonts w:ascii="TH Sarabun New" w:hAnsi="TH Sarabun New" w:eastAsia="TH Sarabun New" w:cs="TH Sarabun New"/>
-                <w:b w:val="0"/>
-                <w:bCs w:val="0"/>
-                <w:i w:val="0"/>
-                <w:iCs w:val="0"/>
-                <w:color w:val="172333"/>
-                <w:sz w:val="28"/>
-                <w:szCs w:val="28"/>
-              </w:rPr>
-            </w:r>
-          </w:p>
-        </w:tc>
-        <w:tc>
-          <w:tcPr>
-            <w:tcW w:w="1831" w:type="dxa"/>
-            <w:tcBorders>
-              <w:top w:val="single" w:sz="4" w:color="C9D3DC"/>
-              <w:left w:val="single" w:sz="4" w:color="C9D3DC"/>
-              <w:bottom w:val="single" w:sz="4" w:color="C9D3DC"/>
-              <w:right w:val="single" w:sz="4" w:color="C9D3DC"/>
-            </w:tcBorders>
-            <w:shd w:val="clear" w:fill="FFFFFF"/>
-            <w:tcMar>
-              <w:top w:w="40" w:type="dxa"/>
-              <w:left w:w="90" w:type="dxa"/>
-              <w:bottom w:w="40" w:type="dxa"/>
-              <w:right w:w="90" w:type="dxa"/>
-            </w:tcMar>
-          </w:tcPr>
-          <w:p>
-            <w:pPr>
-              <w:keepNext/>
-            </w:pPr>
-            <w:r>
-              <w:rPr>
-                <w:rFonts w:ascii="TH Sarabun New" w:hAnsi="TH Sarabun New" w:eastAsia="TH Sarabun New" w:cs="TH Sarabun New"/>
-                <w:b w:val="0"/>
-                <w:bCs w:val="0"/>
-                <w:i w:val="0"/>
-                <w:iCs w:val="0"/>
-                <w:color w:val="172333"/>
-                <w:sz w:val="28"/>
-                <w:szCs w:val="28"/>
-              </w:rPr>
-            </w:r>
-          </w:p>
-        </w:tc>
-        <w:tc>
-          <w:tcPr>
-            <w:tcW w:w="1352" w:type="dxa"/>
-            <w:tcBorders>
-              <w:top w:val="single" w:sz="4" w:color="C9D3DC"/>
-              <w:left w:val="single" w:sz="4" w:color="C9D3DC"/>
-              <w:bottom w:val="single" w:sz="4" w:color="C9D3DC"/>
-              <w:right w:val="single" w:sz="4" w:color="C9D3DC"/>
-            </w:tcBorders>
-            <w:shd w:val="clear" w:fill="FFFFFF"/>
-            <w:tcMar>
-              <w:top w:w="40" w:type="dxa"/>
-              <w:left w:w="90" w:type="dxa"/>
-              <w:bottom w:w="40" w:type="dxa"/>
-              <w:right w:w="90" w:type="dxa"/>
-            </w:tcMar>
-          </w:tcPr>
-          <w:p>
-            <w:pPr>
-              <w:keepNext/>
-            </w:pPr>
-            <w:r>
-              <w:rPr>
-                <w:rFonts w:ascii="TH Sarabun New" w:hAnsi="TH Sarabun New" w:eastAsia="TH Sarabun New" w:cs="TH Sarabun New"/>
-                <w:b w:val="0"/>
-                <w:bCs w:val="0"/>
-                <w:i w:val="0"/>
-                <w:iCs w:val="0"/>
-                <w:color w:val="172333"/>
-                <w:sz w:val="28"/>
-                <w:szCs w:val="28"/>
-              </w:rPr>
+              <w:top w:val="single" w:sz="6" w:color="C9D3DC"/>
+              <w:left w:val="single" w:sz="6" w:color="C9D3DC"/>
+              <w:bottom w:val="single" w:sz="6" w:color="C9D3DC"/>
+              <w:right w:val="single" w:sz="6" w:color="C9D3DC"/>
+            </w:tcBorders>
+            <w:tcMar>
+              <w:top w:w="45" w:type="dxa"/>
+              <w:left w:w="90" w:type="dxa"/>
+              <w:bottom w:w="45" w:type="dxa"/>
+              <w:right w:w="90" w:type="dxa"/>
+            </w:tcMar>
+          </w:tcPr>
+          <w:p>
+            <w:r>
+              <w:t>CR-FX-01 (1): แจ้งเมื่อสถานะเปลี่ยน</w:t>
+            </w:r>
+          </w:p>
+        </w:tc>
+        <w:tc>
+          <w:tcPr>
+            <w:tcBorders>
+              <w:top w:val="single" w:sz="6" w:color="C9D3DC"/>
+              <w:bottom w:val="single" w:sz="6" w:color="C9D3DC"/>
+              <w:right w:val="single" w:sz="6" w:color="C9D3DC"/>
+            </w:tcBorders>
+            <w:tcMar>
+              <w:top w:w="45" w:type="dxa"/>
+              <w:left w:w="90" w:type="dxa"/>
+              <w:bottom w:w="45" w:type="dxa"/>
+              <w:right w:w="90" w:type="dxa"/>
+            </w:tcMar>
+          </w:tcPr>
+          <w:p>
+            <w:r>
+              <w:t>แก้ FR-01, FR-05; เพิ่ม FR-07; เกี่ยวข้อง NFR-01; เพิ่ม DR-01/02</w:t>
+            </w:r>
+          </w:p>
+        </w:tc>
+        <w:tc>
+          <w:tcPr>
+            <w:tcBorders>
+              <w:top w:val="single" w:sz="6" w:color="C9D3DC"/>
+              <w:bottom w:val="single" w:sz="6" w:color="C9D3DC"/>
+              <w:right w:val="single" w:sz="6" w:color="C9D3DC"/>
+            </w:tcBorders>
+            <w:tcMar>
+              <w:top w:w="45" w:type="dxa"/>
+              <w:left w:w="90" w:type="dxa"/>
+              <w:bottom w:w="45" w:type="dxa"/>
+              <w:right w:w="90" w:type="dxa"/>
+            </w:tcMar>
+          </w:tcPr>
+          <w:p>
+            <w:r>
+              <w:t>แก้ US-01, UC-01, UC-02, AC-01; เพิ่ม US-12, UC-05, AC-06</w:t>
+            </w:r>
+          </w:p>
+        </w:tc>
+        <w:tc>
+          <w:tcPr>
+            <w:tcBorders>
+              <w:top w:val="single" w:sz="6" w:color="C9D3DC"/>
+              <w:bottom w:val="single" w:sz="6" w:color="C9D3DC"/>
+              <w:right w:val="single" w:sz="6" w:color="C9D3DC"/>
+            </w:tcBorders>
+            <w:tcMar>
+              <w:top w:w="45" w:type="dxa"/>
+              <w:left w:w="90" w:type="dxa"/>
+              <w:bottom w:w="45" w:type="dxa"/>
+              <w:right w:w="90" w:type="dxa"/>
+            </w:tcMar>
+          </w:tcPr>
+          <w:p>
+            <w:r>
+              <w:t>หัวข้อ3 FR,</w:t>
+            </w:r>
+          </w:p>
+          <w:p>
+            <w:r>
+              <w:t>หัวข้อ6 Data, หัวข้อ7 Model, หัวข้อ9 Trace</w:t>
+            </w:r>
+          </w:p>
+        </w:tc>
+        <w:tc>
+          <w:tcPr>
+            <w:tcBorders>
+              <w:top w:val="single" w:sz="6" w:color="C9D3DC"/>
+              <w:bottom w:val="single" w:sz="6" w:color="C9D3DC"/>
+              <w:right w:val="single" w:sz="6" w:color="C9D3DC"/>
+            </w:tcBorders>
+            <w:tcMar>
+              <w:top w:w="45" w:type="dxa"/>
+              <w:left w:w="90" w:type="dxa"/>
+              <w:bottom w:w="45" w:type="dxa"/>
+              <w:right w:w="90" w:type="dxa"/>
+            </w:tcMar>
+          </w:tcPr>
+          <w:p>
+            <w:r>
+              <w:t>Spine ขั้นที่ 5: Web Application → API Application → Database; API บันทึกสถานะก่อนส่งแจ้งลูกค้า</w:t>
+            </w:r>
+          </w:p>
+        </w:tc>
+        <w:tc>
+          <w:tcPr>
+            <w:tcBorders>
+              <w:top w:val="single" w:sz="6" w:color="C9D3DC"/>
+              <w:bottom w:val="single" w:sz="6" w:color="C9D3DC"/>
+              <w:right w:val="single" w:sz="6" w:color="C9D3DC"/>
+            </w:tcBorders>
+            <w:tcMar>
+              <w:top w:w="45" w:type="dxa"/>
+              <w:left w:w="90" w:type="dxa"/>
+              <w:bottom w:w="45" w:type="dxa"/>
+              <w:right w:w="90" w:type="dxa"/>
+            </w:tcMar>
+          </w:tcPr>
+          <w:p>
+            <w:r>
+              <w:t>แก้ + เพิ่ม</w:t>
             </w:r>
           </w:p>
         </w:tc>
@@ -1841,10 +1777,9 @@
           <w:tcPr>
             <w:tcW w:w="1638" w:type="dxa"/>
             <w:tcBorders>
-              <w:top w:val="single" w:sz="4" w:color="C9D3DC"/>
-              <w:left w:val="single" w:sz="4" w:color="C9D3DC"/>
-              <w:bottom w:val="single" w:sz="4" w:color="C9D3DC"/>
-              <w:right w:val="single" w:sz="4" w:color="C9D3DC"/>
+              <w:left w:val="single" w:sz="8" w:color="C9D3DC"/>
+              <w:bottom w:val="single" w:sz="8" w:color="C9D3DC"/>
+              <w:right w:val="single" w:sz="8" w:color="C9D3DC"/>
             </w:tcBorders>
             <w:shd w:val="clear" w:fill="F1F7FA"/>
             <w:tcMar>
@@ -1855,20 +1790,146 @@
             </w:tcMar>
           </w:tcPr>
           <w:p>
-            <w:pPr>
-              <w:keepNext/>
-            </w:pPr>
-            <w:r>
-              <w:rPr>
-                <w:rFonts w:ascii="TH Sarabun New" w:hAnsi="TH Sarabun New" w:eastAsia="TH Sarabun New" w:cs="TH Sarabun New"/>
-                <w:b w:val="0"/>
-                <w:bCs w:val="0"/>
-                <w:i w:val="0"/>
-                <w:iCs w:val="0"/>
-                <w:color w:val="172333"/>
-                <w:sz w:val="28"/>
-                <w:szCs w:val="28"/>
-              </w:rPr>
+            <w:r>
+              <w:t>CR-FX-01 (2): เตือนเมื่อออเดอร์ค้างรับ</w:t>
+            </w:r>
+          </w:p>
+        </w:tc>
+        <w:tc>
+          <w:tcPr>
+            <w:tcBorders>
+              <w:bottom w:val="single" w:sz="8" w:color="C9D3DC"/>
+              <w:right w:val="single" w:sz="8" w:color="C9D3DC"/>
+            </w:tcBorders>
+            <w:shd w:val="clear" w:fill="F1F7FA"/>
+            <w:tcMar>
+              <w:top w:w="40" w:type="dxa"/>
+              <w:left w:w="90" w:type="dxa"/>
+              <w:bottom w:w="40" w:type="dxa"/>
+              <w:right w:w="90" w:type="dxa"/>
+            </w:tcMar>
+          </w:tcPr>
+          <w:p>
+            <w:r>
+              <w:t>เพิ่ม FR-08, NFR-04, DR-01/02 (เกณฑ์เวลาและรอบตรวจยังเป็น TBD)</w:t>
+            </w:r>
+          </w:p>
+        </w:tc>
+        <w:tc>
+          <w:tcPr>
+            <w:tcBorders>
+              <w:bottom w:val="single" w:sz="8" w:color="C9D3DC"/>
+              <w:right w:val="single" w:sz="8" w:color="C9D3DC"/>
+            </w:tcBorders>
+            <w:shd w:val="clear" w:fill="F1F7FA"/>
+            <w:tcMar>
+              <w:top w:w="40" w:type="dxa"/>
+              <w:left w:w="90" w:type="dxa"/>
+              <w:bottom w:w="40" w:type="dxa"/>
+              <w:right w:w="90" w:type="dxa"/>
+            </w:tcMar>
+          </w:tcPr>
+          <w:p>
+            <w:r>
+              <w:t>เพิ่ม US-13, UC-05, AC-08</w:t>
+            </w:r>
+          </w:p>
+        </w:tc>
+        <w:tc>
+          <w:tcPr>
+            <w:tcBorders>
+              <w:bottom w:val="single" w:sz="8" w:color="C9D3DC"/>
+              <w:right w:val="single" w:sz="8" w:color="C9D3DC"/>
+            </w:tcBorders>
+            <w:shd w:val="clear" w:fill="F1F7FA"/>
+            <w:tcMar>
+              <w:top w:w="40" w:type="dxa"/>
+              <w:left w:w="90" w:type="dxa"/>
+              <w:bottom w:w="40" w:type="dxa"/>
+              <w:right w:w="90" w:type="dxa"/>
+            </w:tcMar>
+          </w:tcPr>
+          <w:p>
+            <w:r>
+              <w:t>หัวข้อ3 FR, หัวข้อ5 NFR, หัวข้อ6 Data, หัวข้อ10 Open Issues</w:t>
+            </w:r>
+          </w:p>
+        </w:tc>
+        <w:tc>
+          <w:tcPr>
+            <w:tcBorders>
+              <w:bottom w:val="single" w:sz="8" w:color="C9D3DC"/>
+              <w:right w:val="single" w:sz="8" w:color="C9D3DC"/>
+            </w:tcBorders>
+            <w:shd w:val="clear" w:fill="F1F7FA"/>
+            <w:tcMar>
+              <w:top w:w="40" w:type="dxa"/>
+              <w:left w:w="90" w:type="dxa"/>
+              <w:bottom w:w="40" w:type="dxa"/>
+              <w:right w:w="90" w:type="dxa"/>
+            </w:tcMar>
+          </w:tcPr>
+          <w:p>
+            <w:r>
+              <w:t>Reminder Scheduler → API Application → Database; API ตรวจสถานะและเวลาค้างก่อนส่งเตือน</w:t>
+            </w:r>
+          </w:p>
+        </w:tc>
+        <w:tc>
+          <w:tcPr>
+            <w:tcBorders>
+              <w:bottom w:val="single" w:sz="8" w:color="C9D3DC"/>
+              <w:right w:val="single" w:sz="8" w:color="C9D3DC"/>
+            </w:tcBorders>
+            <w:shd w:val="clear" w:fill="F1F7FA"/>
+            <w:tcMar>
+              <w:top w:w="40" w:type="dxa"/>
+              <w:left w:w="90" w:type="dxa"/>
+              <w:bottom w:w="40" w:type="dxa"/>
+              <w:right w:w="90" w:type="dxa"/>
+            </w:tcMar>
+          </w:tcPr>
+          <w:p>
+            <w:r>
+              <w:t>เพิ่ม / TBD (เกณฑ์เวลาและรอบตรวจเป็น TBD</w:t>
+            </w:r>
+          </w:p>
+        </w:tc>
+      </w:tr>
+      <w:tr>
+        <w:trPr>
+          <w:cantSplit/>
+          <w:trHeight w:val="639" w:hRule="atLeast"/>
+        </w:trPr>
+        <w:tc>
+          <w:tcPr>
+            <w:tcW w:w="481" w:type="dxa"/>
+            <w:tcBorders>
+              <w:top w:val="single" w:sz="4" w:color="C9D3DC"/>
+              <w:left w:val="single" w:sz="4" w:color="C9D3DC"/>
+              <w:bottom w:val="single" w:sz="4" w:color="C9D3DC"/>
+              <w:right w:val="single" w:sz="4" w:color="C9D3DC"/>
+            </w:tcBorders>
+            <w:shd w:val="clear" w:fill="FFFFFF"/>
+            <w:tcMar>
+              <w:top w:w="40" w:type="dxa"/>
+              <w:left w:w="90" w:type="dxa"/>
+              <w:bottom w:w="40" w:type="dxa"/>
+              <w:right w:w="90" w:type="dxa"/>
+            </w:tcMar>
+          </w:tcPr>
+          <w:p>
+            <w:pPr>
+              <w:keepNext/>
+            </w:pPr>
+            <w:r>
+              <w:rPr>
+                <w:rFonts w:ascii="TH Sarabun New" w:hAnsi="TH Sarabun New" w:eastAsia="TH Sarabun New" w:cs="TH Sarabun New"/>
+                <w:color w:val="5A6B7C"/>
+                <w:sz w:val="28"/>
+                <w:szCs w:val="28"/>
+              </w:rPr>
+              <w:t>3</w:t>
             </w:r>
           </w:p>
         </w:tc>
@@ -1876,6 +1937,128 @@
           <w:tcPr>
             <w:tcW w:w="1638" w:type="dxa"/>
             <w:tcBorders>
+              <w:left w:val="single" w:sz="8" w:color="C9D3DC"/>
+              <w:bottom w:val="single" w:sz="8" w:color="C9D3DC"/>
+              <w:right w:val="single" w:sz="8" w:color="C9D3DC"/>
+            </w:tcBorders>
+            <w:tcMar>
+              <w:top w:w="40" w:type="dxa"/>
+              <w:left w:w="90" w:type="dxa"/>
+              <w:bottom w:w="40" w:type="dxa"/>
+              <w:right w:w="90" w:type="dxa"/>
+            </w:tcMar>
+          </w:tcPr>
+          <w:p>
+            <w:r>
+              <w:t>CR-FX-01 (1): แจ้งเฉพาะลูกค้าเจ้าของออเดอร์</w:t>
+            </w:r>
+          </w:p>
+        </w:tc>
+        <w:tc>
+          <w:tcPr>
+            <w:tcBorders>
+              <w:bottom w:val="single" w:sz="8" w:color="C9D3DC"/>
+              <w:right w:val="single" w:sz="8" w:color="C9D3DC"/>
+            </w:tcBorders>
+            <w:tcMar>
+              <w:top w:w="40" w:type="dxa"/>
+              <w:left w:w="90" w:type="dxa"/>
+              <w:bottom w:w="40" w:type="dxa"/>
+              <w:right w:w="90" w:type="dxa"/>
+            </w:tcMar>
+          </w:tcPr>
+          <w:p>
+            <w:r>
+              <w:t>พิ่ม FR-07, BR-02, DR-01/02</w:t>
+            </w:r>
+          </w:p>
+        </w:tc>
+        <w:tc>
+          <w:tcPr>
+            <w:tcBorders>
+              <w:bottom w:val="single" w:sz="8" w:color="C9D3DC"/>
+              <w:right w:val="single" w:sz="8" w:color="C9D3DC"/>
+            </w:tcBorders>
+            <w:tcMar>
+              <w:top w:w="40" w:type="dxa"/>
+              <w:left w:w="90" w:type="dxa"/>
+              <w:bottom w:w="40" w:type="dxa"/>
+              <w:right w:w="90" w:type="dxa"/>
+            </w:tcMar>
+          </w:tcPr>
+          <w:p>
+            <w:r>
+              <w:t>เพิ่ม US-12, UC-05, AC-07</w:t>
+            </w:r>
+          </w:p>
+        </w:tc>
+        <w:tc>
+          <w:tcPr>
+            <w:tcBorders>
+              <w:bottom w:val="single" w:sz="8" w:color="C9D3DC"/>
+              <w:right w:val="single" w:sz="8" w:color="C9D3DC"/>
+            </w:tcBorders>
+            <w:tcMar>
+              <w:top w:w="40" w:type="dxa"/>
+              <w:left w:w="90" w:type="dxa"/>
+              <w:bottom w:w="40" w:type="dxa"/>
+              <w:right w:w="90" w:type="dxa"/>
+            </w:tcMar>
+          </w:tcPr>
+          <w:p>
+            <w:r>
+              <w:t>หัวข้อ3 FR, หัวข้อ4 BR, หัวข้อ6 Data, หัวข้อ7 Model</w:t>
+            </w:r>
+          </w:p>
+        </w:tc>
+        <w:tc>
+          <w:tcPr>
+            <w:tcBorders>
+              <w:bottom w:val="single" w:sz="8" w:color="C9D3DC"/>
+              <w:right w:val="single" w:sz="8" w:color="C9D3DC"/>
+            </w:tcBorders>
+            <w:tcMar>
+              <w:top w:w="40" w:type="dxa"/>
+              <w:left w:w="90" w:type="dxa"/>
+              <w:bottom w:w="40" w:type="dxa"/>
+              <w:right w:w="90" w:type="dxa"/>
+            </w:tcMar>
+          </w:tcPr>
+          <w:p>
+            <w:r>
+              <w:t>API Application ใช้ข้อมูลจาก Database เลือกผู้รับที่ผูกกับออเดอร์ ห้ามส่งข้ามคน</w:t>
+            </w:r>
+          </w:p>
+        </w:tc>
+        <w:tc>
+          <w:tcPr>
+            <w:tcBorders>
+              <w:bottom w:val="single" w:sz="8" w:color="C9D3DC"/>
+              <w:right w:val="single" w:sz="8" w:color="C9D3DC"/>
+            </w:tcBorders>
+            <w:tcMar>
+              <w:top w:w="40" w:type="dxa"/>
+              <w:left w:w="90" w:type="dxa"/>
+              <w:bottom w:w="40" w:type="dxa"/>
+              <w:right w:w="90" w:type="dxa"/>
+            </w:tcMar>
+          </w:tcPr>
+          <w:p>
+            <w:r>
+              <w:t>เพิ่ม (เพิ่มกติกาผู้รับ BR-02)</w:t>
+            </w:r>
+          </w:p>
+        </w:tc>
+      </w:tr>
+      <w:tr>
+        <w:trPr>
+          <w:cantSplit/>
+          <w:trHeight w:val="699" w:hRule="atLeast"/>
+        </w:trPr>
+        <w:tc>
+          <w:tcPr>
+            <w:tcW w:w="481" w:type="dxa"/>
+            <w:tcBorders>
               <w:top w:val="single" w:sz="4" w:color="C9D3DC"/>
               <w:left w:val="single" w:sz="4" w:color="C9D3DC"/>
               <w:bottom w:val="single" w:sz="4" w:color="C9D3DC"/>
@@ -1896,25 +2079,21 @@
             <w:r>
               <w:rPr>
                 <w:rFonts w:ascii="TH Sarabun New" w:hAnsi="TH Sarabun New" w:eastAsia="TH Sarabun New" w:cs="TH Sarabun New"/>
-                <w:b w:val="0"/>
-                <w:bCs w:val="0"/>
-                <w:i w:val="0"/>
-                <w:iCs w:val="0"/>
-                <w:color w:val="172333"/>
-                <w:sz w:val="28"/>
-                <w:szCs w:val="28"/>
-              </w:rPr>
-            </w:r>
-          </w:p>
-        </w:tc>
-        <w:tc>
-          <w:tcPr>
-            <w:tcW w:w="1542" w:type="dxa"/>
-            <w:tcBorders>
-              <w:top w:val="single" w:sz="4" w:color="C9D3DC"/>
-              <w:left w:val="single" w:sz="4" w:color="C9D3DC"/>
-              <w:bottom w:val="single" w:sz="4" w:color="C9D3DC"/>
-              <w:right w:val="single" w:sz="4" w:color="C9D3DC"/>
+                <w:color w:val="5A6B7C"/>
+                <w:sz w:val="28"/>
+                <w:szCs w:val="28"/>
+              </w:rPr>
+              <w:t>4</w:t>
+            </w:r>
+          </w:p>
+        </w:tc>
+        <w:tc>
+          <w:tcPr>
+            <w:tcW w:w="1638" w:type="dxa"/>
+            <w:tcBorders>
+              <w:left w:val="single" w:sz="8" w:color="C9D3DC"/>
+              <w:bottom w:val="single" w:sz="8" w:color="C9D3DC"/>
+              <w:right w:val="single" w:sz="8" w:color="C9D3DC"/>
             </w:tcBorders>
             <w:shd w:val="clear" w:fill="F1F7FA"/>
             <w:tcMar>
@@ -1925,31 +2104,16 @@
             </w:tcMar>
           </w:tcPr>
           <w:p>
-            <w:pPr>
-              <w:keepNext/>
-            </w:pPr>
-            <w:r>
-              <w:rPr>
-                <w:rFonts w:ascii="TH Sarabun New" w:hAnsi="TH Sarabun New" w:eastAsia="TH Sarabun New" w:cs="TH Sarabun New"/>
-                <w:b w:val="0"/>
-                <w:bCs w:val="0"/>
-                <w:i w:val="0"/>
-                <w:iCs w:val="0"/>
-                <w:color w:val="172333"/>
-                <w:sz w:val="28"/>
-                <w:szCs w:val="28"/>
-              </w:rPr>
-            </w:r>
-          </w:p>
-        </w:tc>
-        <w:tc>
-          <w:tcPr>
-            <w:tcW w:w="1156" w:type="dxa"/>
-            <w:tcBorders>
-              <w:top w:val="single" w:sz="4" w:color="C9D3DC"/>
-              <w:left w:val="single" w:sz="4" w:color="C9D3DC"/>
-              <w:bottom w:val="single" w:sz="4" w:color="C9D3DC"/>
-              <w:right w:val="single" w:sz="4" w:color="C9D3DC"/>
+            <w:r>
+              <w:t>CR-FX-01 (3): เลือก opt-in ช่องทางภายนอก และจำกัดข้อมูลส่วนบุคคล</w:t>
+            </w:r>
+          </w:p>
+        </w:tc>
+        <w:tc>
+          <w:tcPr>
+            <w:tcBorders>
+              <w:bottom w:val="single" w:sz="8" w:color="C9D3DC"/>
+              <w:right w:val="single" w:sz="8" w:color="C9D3DC"/>
             </w:tcBorders>
             <w:shd w:val="clear" w:fill="F1F7FA"/>
             <w:tcMar>
@@ -1960,31 +2124,16 @@
             </w:tcMar>
           </w:tcPr>
           <w:p>
-            <w:pPr>
-              <w:keepNext/>
-            </w:pPr>
-            <w:r>
-              <w:rPr>
-                <w:rFonts w:ascii="TH Sarabun New" w:hAnsi="TH Sarabun New" w:eastAsia="TH Sarabun New" w:cs="TH Sarabun New"/>
-                <w:b w:val="0"/>
-                <w:bCs w:val="0"/>
-                <w:i w:val="0"/>
-                <w:iCs w:val="0"/>
-                <w:color w:val="172333"/>
-                <w:sz w:val="28"/>
-                <w:szCs w:val="28"/>
-              </w:rPr>
-            </w:r>
-          </w:p>
-        </w:tc>
-        <w:tc>
-          <w:tcPr>
-            <w:tcW w:w="1831" w:type="dxa"/>
-            <w:tcBorders>
-              <w:top w:val="single" w:sz="4" w:color="C9D3DC"/>
-              <w:left w:val="single" w:sz="4" w:color="C9D3DC"/>
-              <w:bottom w:val="single" w:sz="4" w:color="C9D3DC"/>
-              <w:right w:val="single" w:sz="4" w:color="C9D3DC"/>
+            <w:r>
+              <w:t>แก้ NFR-02 (เดิม); เพิ่ม FR-09 (หรือรวมใน FR-07), BR-03, DR-02 (เก็บค่า opt-in); ช่องทางภายนอกยังเป็น TBD</w:t>
+            </w:r>
+          </w:p>
+        </w:tc>
+        <w:tc>
+          <w:tcPr>
+            <w:tcBorders>
+              <w:bottom w:val="single" w:sz="8" w:color="C9D3DC"/>
+              <w:right w:val="single" w:sz="8" w:color="C9D3DC"/>
             </w:tcBorders>
             <w:shd w:val="clear" w:fill="F1F7FA"/>
             <w:tcMar>
@@ -1995,31 +2144,16 @@
             </w:tcMar>
           </w:tcPr>
           <w:p>
-            <w:pPr>
-              <w:keepNext/>
-            </w:pPr>
-            <w:r>
-              <w:rPr>
-                <w:rFonts w:ascii="TH Sarabun New" w:hAnsi="TH Sarabun New" w:eastAsia="TH Sarabun New" w:cs="TH Sarabun New"/>
-                <w:b w:val="0"/>
-                <w:bCs w:val="0"/>
-                <w:i w:val="0"/>
-                <w:iCs w:val="0"/>
-                <w:color w:val="172333"/>
-                <w:sz w:val="28"/>
-                <w:szCs w:val="28"/>
-              </w:rPr>
-            </w:r>
-          </w:p>
-        </w:tc>
-        <w:tc>
-          <w:tcPr>
-            <w:tcW w:w="1352" w:type="dxa"/>
-            <w:tcBorders>
-              <w:top w:val="single" w:sz="4" w:color="C9D3DC"/>
-              <w:left w:val="single" w:sz="4" w:color="C9D3DC"/>
-              <w:bottom w:val="single" w:sz="4" w:color="C9D3DC"/>
-              <w:right w:val="single" w:sz="4" w:color="C9D3DC"/>
+            <w:r>
+              <w:t>เพิ่ม US-14 (หรือรวมใน US-12), AC-09 (ตรวจ opt-in และ NFR-02)</w:t>
+            </w:r>
+          </w:p>
+        </w:tc>
+        <w:tc>
+          <w:tcPr>
+            <w:tcBorders>
+              <w:bottom w:val="single" w:sz="8" w:color="C9D3DC"/>
+              <w:right w:val="single" w:sz="8" w:color="C9D3DC"/>
             </w:tcBorders>
             <w:shd w:val="clear" w:fill="F1F7FA"/>
             <w:tcMar>
@@ -2030,20 +2164,48 @@
             </w:tcMar>
           </w:tcPr>
           <w:p>
-            <w:pPr>
-              <w:keepNext/>
-            </w:pPr>
-            <w:r>
-              <w:rPr>
-                <w:rFonts w:ascii="TH Sarabun New" w:hAnsi="TH Sarabun New" w:eastAsia="TH Sarabun New" w:cs="TH Sarabun New"/>
-                <w:b w:val="0"/>
-                <w:bCs w:val="0"/>
-                <w:i w:val="0"/>
-                <w:iCs w:val="0"/>
-                <w:color w:val="172333"/>
-                <w:sz w:val="28"/>
-                <w:szCs w:val="28"/>
-              </w:rPr>
+            <w:r>
+              <w:t>หัวข้อ3 FR, หัวข้อ5 NFR, หัวข้อ8 External Interface, หัวข้อ10 Open Issues</w:t>
+            </w:r>
+          </w:p>
+        </w:tc>
+        <w:tc>
+          <w:tcPr>
+            <w:tcBorders>
+              <w:bottom w:val="single" w:sz="8" w:color="C9D3DC"/>
+              <w:right w:val="single" w:sz="8" w:color="C9D3DC"/>
+            </w:tcBorders>
+            <w:shd w:val="clear" w:fill="F1F7FA"/>
+            <w:tcMar>
+              <w:top w:w="40" w:type="dxa"/>
+              <w:left w:w="90" w:type="dxa"/>
+              <w:bottom w:w="40" w:type="dxa"/>
+              <w:right w:w="90" w:type="dxa"/>
+            </w:tcMar>
+          </w:tcPr>
+          <w:p>
+            <w:r>
+              <w:t>Web Application → API Application → EXT-01 ช่องทางแจ้งเตือนภายนอก [Extension · TBD] (จัดเป็น Later ใน G3)</w:t>
+            </w:r>
+          </w:p>
+        </w:tc>
+        <w:tc>
+          <w:tcPr>
+            <w:tcBorders>
+              <w:bottom w:val="single" w:sz="8" w:color="C9D3DC"/>
+              <w:right w:val="single" w:sz="8" w:color="C9D3DC"/>
+            </w:tcBorders>
+            <w:shd w:val="clear" w:fill="F1F7FA"/>
+            <w:tcMar>
+              <w:top w:w="40" w:type="dxa"/>
+              <w:left w:w="90" w:type="dxa"/>
+              <w:bottom w:w="40" w:type="dxa"/>
+              <w:right w:w="90" w:type="dxa"/>
+            </w:tcMar>
+          </w:tcPr>
+          <w:p>
+            <w:r>
+              <w:t>แก้ + เพิ่ม / TBD (มีใน SRS แต่เลื่อนเป็น Later รอสรุป EXT-01)</w:t>
             </w:r>
           </w:p>
         </w:tc>
@@ -2081,7 +2243,7 @@
                 <w:sz w:val="28"/>
                 <w:szCs w:val="28"/>
               </w:rPr>
-              <w:t>3</w:t>
+              <w:t>5</w:t>
             </w:r>
           </w:p>
         </w:tc>
@@ -2089,209 +2251,115 @@
           <w:tcPr>
             <w:tcW w:w="1638" w:type="dxa"/>
             <w:tcBorders>
-              <w:top w:val="single" w:sz="4" w:color="C9D3DC"/>
-              <w:left w:val="single" w:sz="4" w:color="C9D3DC"/>
-              <w:bottom w:val="single" w:sz="4" w:color="C9D3DC"/>
-              <w:right w:val="single" w:sz="4" w:color="C9D3DC"/>
-            </w:tcBorders>
-            <w:shd w:val="clear" w:fill="FFFFFF"/>
-            <w:tcMar>
-              <w:top w:w="40" w:type="dxa"/>
-              <w:left w:w="90" w:type="dxa"/>
-              <w:bottom w:w="40" w:type="dxa"/>
-              <w:right w:w="90" w:type="dxa"/>
-            </w:tcMar>
-          </w:tcPr>
-          <w:p>
-            <w:pPr>
-              <w:keepNext/>
-            </w:pPr>
-            <w:r>
-              <w:rPr>
-                <w:rFonts w:ascii="TH Sarabun New" w:hAnsi="TH Sarabun New" w:eastAsia="TH Sarabun New" w:cs="TH Sarabun New"/>
-                <w:b w:val="0"/>
-                <w:bCs w:val="0"/>
-                <w:i w:val="0"/>
-                <w:iCs w:val="0"/>
-                <w:color w:val="172333"/>
-                <w:sz w:val="28"/>
-                <w:szCs w:val="28"/>
-              </w:rPr>
-            </w:r>
-          </w:p>
-        </w:tc>
-        <w:tc>
-          <w:tcPr>
-            <w:tcW w:w="1638" w:type="dxa"/>
-            <w:tcBorders>
-              <w:top w:val="single" w:sz="4" w:color="C9D3DC"/>
-              <w:left w:val="single" w:sz="4" w:color="C9D3DC"/>
-              <w:bottom w:val="single" w:sz="4" w:color="C9D3DC"/>
-              <w:right w:val="single" w:sz="4" w:color="C9D3DC"/>
-            </w:tcBorders>
-            <w:shd w:val="clear" w:fill="FFFFFF"/>
-            <w:tcMar>
-              <w:top w:w="40" w:type="dxa"/>
-              <w:left w:w="90" w:type="dxa"/>
-              <w:bottom w:w="40" w:type="dxa"/>
-              <w:right w:w="90" w:type="dxa"/>
-            </w:tcMar>
-          </w:tcPr>
-          <w:p>
-            <w:pPr>
-              <w:keepNext/>
-            </w:pPr>
-            <w:r>
-              <w:rPr>
-                <w:rFonts w:ascii="TH Sarabun New" w:hAnsi="TH Sarabun New" w:eastAsia="TH Sarabun New" w:cs="TH Sarabun New"/>
-                <w:b w:val="0"/>
-                <w:bCs w:val="0"/>
-                <w:i w:val="0"/>
-                <w:iCs w:val="0"/>
-                <w:color w:val="172333"/>
-                <w:sz w:val="28"/>
-                <w:szCs w:val="28"/>
-              </w:rPr>
-            </w:r>
-          </w:p>
-        </w:tc>
-        <w:tc>
-          <w:tcPr>
-            <w:tcW w:w="1542" w:type="dxa"/>
-            <w:tcBorders>
-              <w:top w:val="single" w:sz="4" w:color="C9D3DC"/>
-              <w:left w:val="single" w:sz="4" w:color="C9D3DC"/>
-              <w:bottom w:val="single" w:sz="4" w:color="C9D3DC"/>
-              <w:right w:val="single" w:sz="4" w:color="C9D3DC"/>
-            </w:tcBorders>
-            <w:shd w:val="clear" w:fill="FFFFFF"/>
-            <w:tcMar>
-              <w:top w:w="40" w:type="dxa"/>
-              <w:left w:w="90" w:type="dxa"/>
-              <w:bottom w:w="40" w:type="dxa"/>
-              <w:right w:w="90" w:type="dxa"/>
-            </w:tcMar>
-          </w:tcPr>
-          <w:p>
-            <w:pPr>
-              <w:keepNext/>
-            </w:pPr>
-            <w:r>
-              <w:rPr>
-                <w:rFonts w:ascii="TH Sarabun New" w:hAnsi="TH Sarabun New" w:eastAsia="TH Sarabun New" w:cs="TH Sarabun New"/>
-                <w:b w:val="0"/>
-                <w:bCs w:val="0"/>
-                <w:i w:val="0"/>
-                <w:iCs w:val="0"/>
-                <w:color w:val="172333"/>
-                <w:sz w:val="28"/>
-                <w:szCs w:val="28"/>
-              </w:rPr>
-            </w:r>
-          </w:p>
-        </w:tc>
-        <w:tc>
-          <w:tcPr>
-            <w:tcW w:w="1156" w:type="dxa"/>
-            <w:tcBorders>
-              <w:top w:val="single" w:sz="4" w:color="C9D3DC"/>
-              <w:left w:val="single" w:sz="4" w:color="C9D3DC"/>
-              <w:bottom w:val="single" w:sz="4" w:color="C9D3DC"/>
-              <w:right w:val="single" w:sz="4" w:color="C9D3DC"/>
-            </w:tcBorders>
-            <w:shd w:val="clear" w:fill="FFFFFF"/>
-            <w:tcMar>
-              <w:top w:w="40" w:type="dxa"/>
-              <w:left w:w="90" w:type="dxa"/>
-              <w:bottom w:w="40" w:type="dxa"/>
-              <w:right w:w="90" w:type="dxa"/>
-            </w:tcMar>
-          </w:tcPr>
-          <w:p>
-            <w:pPr>
-              <w:keepNext/>
-            </w:pPr>
-            <w:r>
-              <w:rPr>
-                <w:rFonts w:ascii="TH Sarabun New" w:hAnsi="TH Sarabun New" w:eastAsia="TH Sarabun New" w:cs="TH Sarabun New"/>
-                <w:b w:val="0"/>
-                <w:bCs w:val="0"/>
-                <w:i w:val="0"/>
-                <w:iCs w:val="0"/>
-                <w:color w:val="172333"/>
-                <w:sz w:val="28"/>
-                <w:szCs w:val="28"/>
-              </w:rPr>
-            </w:r>
-          </w:p>
-        </w:tc>
-        <w:tc>
-          <w:tcPr>
-            <w:tcW w:w="1831" w:type="dxa"/>
-            <w:tcBorders>
-              <w:top w:val="single" w:sz="4" w:color="C9D3DC"/>
-              <w:left w:val="single" w:sz="4" w:color="C9D3DC"/>
-              <w:bottom w:val="single" w:sz="4" w:color="C9D3DC"/>
-              <w:right w:val="single" w:sz="4" w:color="C9D3DC"/>
-            </w:tcBorders>
-            <w:shd w:val="clear" w:fill="FFFFFF"/>
-            <w:tcMar>
-              <w:top w:w="40" w:type="dxa"/>
-              <w:left w:w="90" w:type="dxa"/>
-              <w:bottom w:w="40" w:type="dxa"/>
-              <w:right w:w="90" w:type="dxa"/>
-            </w:tcMar>
-          </w:tcPr>
-          <w:p>
-            <w:pPr>
-              <w:keepNext/>
-            </w:pPr>
-            <w:r>
-              <w:rPr>
-                <w:rFonts w:ascii="TH Sarabun New" w:hAnsi="TH Sarabun New" w:eastAsia="TH Sarabun New" w:cs="TH Sarabun New"/>
-                <w:b w:val="0"/>
-                <w:bCs w:val="0"/>
-                <w:i w:val="0"/>
-                <w:iCs w:val="0"/>
-                <w:color w:val="172333"/>
-                <w:sz w:val="28"/>
-                <w:szCs w:val="28"/>
-              </w:rPr>
-            </w:r>
-          </w:p>
-        </w:tc>
-        <w:tc>
-          <w:tcPr>
-            <w:tcW w:w="1352" w:type="dxa"/>
-            <w:tcBorders>
-              <w:top w:val="single" w:sz="4" w:color="C9D3DC"/>
-              <w:left w:val="single" w:sz="4" w:color="C9D3DC"/>
-              <w:bottom w:val="single" w:sz="4" w:color="C9D3DC"/>
-              <w:right w:val="single" w:sz="4" w:color="C9D3DC"/>
-            </w:tcBorders>
-            <w:shd w:val="clear" w:fill="FFFFFF"/>
-            <w:tcMar>
-              <w:top w:w="40" w:type="dxa"/>
-              <w:left w:w="90" w:type="dxa"/>
-              <w:bottom w:w="40" w:type="dxa"/>
-              <w:right w:w="90" w:type="dxa"/>
-            </w:tcMar>
-          </w:tcPr>
-          <w:p>
-            <w:pPr>
-              <w:keepNext/>
-            </w:pPr>
-            <w:r>
-              <w:rPr>
-                <w:rFonts w:ascii="TH Sarabun New" w:hAnsi="TH Sarabun New" w:eastAsia="TH Sarabun New" w:cs="TH Sarabun New"/>
-                <w:b w:val="0"/>
-                <w:bCs w:val="0"/>
-                <w:i w:val="0"/>
-                <w:iCs w:val="0"/>
-                <w:color w:val="172333"/>
-                <w:sz w:val="28"/>
-                <w:szCs w:val="28"/>
-              </w:rPr>
+              <w:left w:val="single" w:sz="8" w:color="C9D3DC"/>
+              <w:bottom w:val="single" w:sz="8" w:color="C9D3DC"/>
+              <w:right w:val="single" w:sz="8" w:color="C9D3DC"/>
+            </w:tcBorders>
+            <w:tcMar>
+              <w:top w:w="40" w:type="dxa"/>
+              <w:left w:w="90" w:type="dxa"/>
+              <w:bottom w:w="40" w:type="dxa"/>
+              <w:right w:w="90" w:type="dxa"/>
+            </w:tcMar>
+          </w:tcPr>
+          <w:p>
+            <w:r>
+              <w:t>SRS เดิม: กฎ Cut-off ห้ามยกเลิกเมื่อกำลังทำ (E-05, C-01)</w:t>
+            </w:r>
+          </w:p>
+        </w:tc>
+        <w:tc>
+          <w:tcPr>
+            <w:tcBorders>
+              <w:bottom w:val="single" w:sz="8" w:color="C9D3DC"/>
+              <w:right w:val="single" w:sz="8" w:color="C9D3DC"/>
+            </w:tcBorders>
+            <w:tcMar>
+              <w:top w:w="40" w:type="dxa"/>
+              <w:left w:w="90" w:type="dxa"/>
+              <w:bottom w:w="40" w:type="dxa"/>
+              <w:right w:w="90" w:type="dxa"/>
+            </w:tcMar>
+          </w:tcPr>
+          <w:p>
+            <w:r>
+              <w:t>FR-03, BR-01, NFR-03 (เดิม)</w:t>
+            </w:r>
+          </w:p>
+        </w:tc>
+        <w:tc>
+          <w:tcPr>
+            <w:tcBorders>
+              <w:bottom w:val="single" w:sz="8" w:color="C9D3DC"/>
+              <w:right w:val="single" w:sz="8" w:color="C9D3DC"/>
+            </w:tcBorders>
+            <w:tcMar>
+              <w:top w:w="40" w:type="dxa"/>
+              <w:left w:w="90" w:type="dxa"/>
+              <w:bottom w:w="40" w:type="dxa"/>
+              <w:right w:w="90" w:type="dxa"/>
+            </w:tcMar>
+          </w:tcPr>
+          <w:p>
+            <w:r>
+              <w:t>US-09, US-10, UC-04, AC-05 (เดิม)</w:t>
+            </w:r>
+          </w:p>
+        </w:tc>
+        <w:tc>
+          <w:tcPr>
+            <w:tcBorders>
+              <w:bottom w:val="single" w:sz="8" w:color="C9D3DC"/>
+              <w:right w:val="single" w:sz="8" w:color="C9D3DC"/>
+            </w:tcBorders>
+            <w:tcMar>
+              <w:top w:w="40" w:type="dxa"/>
+              <w:left w:w="90" w:type="dxa"/>
+              <w:bottom w:w="40" w:type="dxa"/>
+              <w:right w:w="90" w:type="dxa"/>
+            </w:tcMar>
+          </w:tcPr>
+          <w:p>
+            <w:r>
+              <w:t>หัวข้อ3 FR, หัวข้อ4 BR, หัวข้อ7 Lifecycle</w:t>
+            </w:r>
+          </w:p>
+        </w:tc>
+        <w:tc>
+          <w:tcPr>
+            <w:tcBorders>
+              <w:bottom w:val="single" w:sz="8" w:color="C9D3DC"/>
+              <w:right w:val="single" w:sz="8" w:color="C9D3DC"/>
+            </w:tcBorders>
+            <w:tcMar>
+              <w:top w:w="40" w:type="dxa"/>
+              <w:left w:w="90" w:type="dxa"/>
+              <w:bottom w:w="40" w:type="dxa"/>
+              <w:right w:w="90" w:type="dxa"/>
+            </w:tcMar>
+          </w:tcPr>
+          <w:p>
+            <w:r>
+              <w:t>Spine ขั้นที่ 3: API Application ตรวจสิทธิ์และ BR-01 ก่อนบันทึกสถานะ และแจ้งหลังเปลี่ยนสถานะสำเร็จ</w:t>
+            </w:r>
+          </w:p>
+        </w:tc>
+        <w:tc>
+          <w:tcPr>
+            <w:tcBorders>
+              <w:bottom w:val="single" w:sz="8" w:color="C9D3DC"/>
+              <w:right w:val="single" w:sz="8" w:color="C9D3DC"/>
+            </w:tcBorders>
+            <w:tcMar>
+              <w:top w:w="40" w:type="dxa"/>
+              <w:left w:w="90" w:type="dxa"/>
+              <w:bottom w:w="40" w:type="dxa"/>
+              <w:right w:w="90" w:type="dxa"/>
+            </w:tcMar>
+          </w:tcPr>
+          <w:p>
+            <w:r>
+              <w:t>ไม่กระทบ (คงกฎ BR-01 เดิม)</w:t>
             </w:r>
           </w:p>
         </w:tc>
@@ -2320,7 +2388,7 @@
           </w:tcPr>
           <w:p>
             <w:pPr>
-              <w:keepNext/>
+              <w:keepNext w:val="0"/>
             </w:pPr>
             <w:r>
               <w:rPr>
@@ -2329,7 +2397,7 @@
                 <w:sz w:val="28"/>
                 <w:szCs w:val="28"/>
               </w:rPr>
-              <w:t>4</w:t>
+              <w:t>6</w:t>
             </w:r>
           </w:p>
         </w:tc>
@@ -2337,10 +2405,9 @@
           <w:tcPr>
             <w:tcW w:w="1638" w:type="dxa"/>
             <w:tcBorders>
-              <w:top w:val="single" w:sz="4" w:color="C9D3DC"/>
-              <w:left w:val="single" w:sz="4" w:color="C9D3DC"/>
-              <w:bottom w:val="single" w:sz="4" w:color="C9D3DC"/>
-              <w:right w:val="single" w:sz="4" w:color="C9D3DC"/>
+              <w:left w:val="single" w:sz="8" w:color="C9D3DC"/>
+              <w:bottom w:val="single" w:sz="8" w:color="C9D3DC"/>
+              <w:right w:val="single" w:sz="8" w:color="C9D3DC"/>
             </w:tcBorders>
             <w:shd w:val="clear" w:fill="F1F7FA"/>
             <w:tcMar>
@@ -2351,31 +2418,16 @@
             </w:tcMar>
           </w:tcPr>
           <w:p>
-            <w:pPr>
-              <w:keepNext/>
-            </w:pPr>
-            <w:r>
-              <w:rPr>
-                <w:rFonts w:ascii="TH Sarabun New" w:hAnsi="TH Sarabun New" w:eastAsia="TH Sarabun New" w:cs="TH Sarabun New"/>
-                <w:b w:val="0"/>
-                <w:bCs w:val="0"/>
-                <w:i w:val="0"/>
-                <w:iCs w:val="0"/>
-                <w:color w:val="172333"/>
-                <w:sz w:val="28"/>
-                <w:szCs w:val="28"/>
-              </w:rPr>
-            </w:r>
-          </w:p>
-        </w:tc>
-        <w:tc>
-          <w:tcPr>
-            <w:tcW w:w="1638" w:type="dxa"/>
-            <w:tcBorders>
-              <w:top w:val="single" w:sz="4" w:color="C9D3DC"/>
-              <w:left w:val="single" w:sz="4" w:color="C9D3DC"/>
-              <w:bottom w:val="single" w:sz="4" w:color="C9D3DC"/>
-              <w:right w:val="single" w:sz="4" w:color="C9D3DC"/>
+            <w:r>
+              <w:t>SRS เดิม: คิวต้องเรียงตามลำดับ FIFO (E-01, E-04)</w:t>
+            </w:r>
+          </w:p>
+        </w:tc>
+        <w:tc>
+          <w:tcPr>
+            <w:tcBorders>
+              <w:bottom w:val="single" w:sz="8" w:color="C9D3DC"/>
+              <w:right w:val="single" w:sz="8" w:color="C9D3DC"/>
             </w:tcBorders>
             <w:shd w:val="clear" w:fill="F1F7FA"/>
             <w:tcMar>
@@ -2386,31 +2438,16 @@
             </w:tcMar>
           </w:tcPr>
           <w:p>
-            <w:pPr>
-              <w:keepNext/>
-            </w:pPr>
-            <w:r>
-              <w:rPr>
-                <w:rFonts w:ascii="TH Sarabun New" w:hAnsi="TH Sarabun New" w:eastAsia="TH Sarabun New" w:cs="TH Sarabun New"/>
-                <w:b w:val="0"/>
-                <w:bCs w:val="0"/>
-                <w:i w:val="0"/>
-                <w:iCs w:val="0"/>
-                <w:color w:val="172333"/>
-                <w:sz w:val="28"/>
-                <w:szCs w:val="28"/>
-              </w:rPr>
-            </w:r>
-          </w:p>
-        </w:tc>
-        <w:tc>
-          <w:tcPr>
-            <w:tcW w:w="1542" w:type="dxa"/>
-            <w:tcBorders>
-              <w:top w:val="single" w:sz="4" w:color="C9D3DC"/>
-              <w:left w:val="single" w:sz="4" w:color="C9D3DC"/>
-              <w:bottom w:val="single" w:sz="4" w:color="C9D3DC"/>
-              <w:right w:val="single" w:sz="4" w:color="C9D3DC"/>
+            <w:r>
+              <w:t>FR-01, FR-04, NFR-01, NFR-03 (เดิม)</w:t>
+            </w:r>
+          </w:p>
+        </w:tc>
+        <w:tc>
+          <w:tcPr>
+            <w:tcBorders>
+              <w:bottom w:val="single" w:sz="8" w:color="C9D3DC"/>
+              <w:right w:val="single" w:sz="8" w:color="C9D3DC"/>
             </w:tcBorders>
             <w:shd w:val="clear" w:fill="F1F7FA"/>
             <w:tcMar>
@@ -2421,31 +2458,16 @@
             </w:tcMar>
           </w:tcPr>
           <w:p>
-            <w:pPr>
-              <w:keepNext/>
-            </w:pPr>
-            <w:r>
-              <w:rPr>
-                <w:rFonts w:ascii="TH Sarabun New" w:hAnsi="TH Sarabun New" w:eastAsia="TH Sarabun New" w:cs="TH Sarabun New"/>
-                <w:b w:val="0"/>
-                <w:bCs w:val="0"/>
-                <w:i w:val="0"/>
-                <w:iCs w:val="0"/>
-                <w:color w:val="172333"/>
-                <w:sz w:val="28"/>
-                <w:szCs w:val="28"/>
-              </w:rPr>
-            </w:r>
-          </w:p>
-        </w:tc>
-        <w:tc>
-          <w:tcPr>
-            <w:tcW w:w="1156" w:type="dxa"/>
-            <w:tcBorders>
-              <w:top w:val="single" w:sz="4" w:color="C9D3DC"/>
-              <w:left w:val="single" w:sz="4" w:color="C9D3DC"/>
-              <w:bottom w:val="single" w:sz="4" w:color="C9D3DC"/>
-              <w:right w:val="single" w:sz="4" w:color="C9D3DC"/>
+            <w:r>
+              <w:t>US-01–US-04, UC-01, UC-02, AC-01, AC-02 (เดิม)</w:t>
+            </w:r>
+          </w:p>
+        </w:tc>
+        <w:tc>
+          <w:tcPr>
+            <w:tcBorders>
+              <w:bottom w:val="single" w:sz="8" w:color="C9D3DC"/>
+              <w:right w:val="single" w:sz="8" w:color="C9D3DC"/>
             </w:tcBorders>
             <w:shd w:val="clear" w:fill="F1F7FA"/>
             <w:tcMar>
@@ -2456,31 +2478,16 @@
             </w:tcMar>
           </w:tcPr>
           <w:p>
-            <w:pPr>
-              <w:keepNext/>
-            </w:pPr>
-            <w:r>
-              <w:rPr>
-                <w:rFonts w:ascii="TH Sarabun New" w:hAnsi="TH Sarabun New" w:eastAsia="TH Sarabun New" w:cs="TH Sarabun New"/>
-                <w:b w:val="0"/>
-                <w:bCs w:val="0"/>
-                <w:i w:val="0"/>
-                <w:iCs w:val="0"/>
-                <w:color w:val="172333"/>
-                <w:sz w:val="28"/>
-                <w:szCs w:val="28"/>
-              </w:rPr>
-            </w:r>
-          </w:p>
-        </w:tc>
-        <w:tc>
-          <w:tcPr>
-            <w:tcW w:w="1831" w:type="dxa"/>
-            <w:tcBorders>
-              <w:top w:val="single" w:sz="4" w:color="C9D3DC"/>
-              <w:left w:val="single" w:sz="4" w:color="C9D3DC"/>
-              <w:bottom w:val="single" w:sz="4" w:color="C9D3DC"/>
-              <w:right w:val="single" w:sz="4" w:color="C9D3DC"/>
+            <w:r>
+              <w:t>หัวข้อ3 FR, หัวข้อ5 NFR, หัวข้อ6 Data, หัวข้อ7 Lifecycle</w:t>
+            </w:r>
+          </w:p>
+        </w:tc>
+        <w:tc>
+          <w:tcPr>
+            <w:tcBorders>
+              <w:bottom w:val="single" w:sz="8" w:color="C9D3DC"/>
+              <w:right w:val="single" w:sz="8" w:color="C9D3DC"/>
             </w:tcBorders>
             <w:shd w:val="clear" w:fill="F1F7FA"/>
             <w:tcMar>
@@ -2491,31 +2498,16 @@
             </w:tcMar>
           </w:tcPr>
           <w:p>
-            <w:pPr>
-              <w:keepNext/>
-            </w:pPr>
-            <w:r>
-              <w:rPr>
-                <w:rFonts w:ascii="TH Sarabun New" w:hAnsi="TH Sarabun New" w:eastAsia="TH Sarabun New" w:cs="TH Sarabun New"/>
-                <w:b w:val="0"/>
-                <w:bCs w:val="0"/>
-                <w:i w:val="0"/>
-                <w:iCs w:val="0"/>
-                <w:color w:val="172333"/>
-                <w:sz w:val="28"/>
-                <w:szCs w:val="28"/>
-              </w:rPr>
-            </w:r>
-          </w:p>
-        </w:tc>
-        <w:tc>
-          <w:tcPr>
-            <w:tcW w:w="1352" w:type="dxa"/>
-            <w:tcBorders>
-              <w:top w:val="single" w:sz="4" w:color="C9D3DC"/>
-              <w:left w:val="single" w:sz="4" w:color="C9D3DC"/>
-              <w:bottom w:val="single" w:sz="4" w:color="C9D3DC"/>
-              <w:right w:val="single" w:sz="4" w:color="C9D3DC"/>
+            <w:r>
+              <w:t>Spine ขั้นที่ 2: Web Application / API Application / Database; Reminder Scheduler ตรวจเวลาค้างเท่านั้น ไม่จัดลำดับคิวใหม่</w:t>
+            </w:r>
+          </w:p>
+        </w:tc>
+        <w:tc>
+          <w:tcPr>
+            <w:tcBorders>
+              <w:bottom w:val="single" w:sz="8" w:color="C9D3DC"/>
+              <w:right w:val="single" w:sz="8" w:color="C9D3DC"/>
             </w:tcBorders>
             <w:shd w:val="clear" w:fill="F1F7FA"/>
             <w:tcMar>
@@ -2526,516 +2518,8 @@
             </w:tcMar>
           </w:tcPr>
           <w:p>
-            <w:pPr>
-              <w:keepNext/>
-            </w:pPr>
-            <w:r>
-              <w:rPr>
-                <w:rFonts w:ascii="TH Sarabun New" w:hAnsi="TH Sarabun New" w:eastAsia="TH Sarabun New" w:cs="TH Sarabun New"/>
-                <w:b w:val="0"/>
-                <w:bCs w:val="0"/>
-                <w:i w:val="0"/>
-                <w:iCs w:val="0"/>
-                <w:color w:val="172333"/>
-                <w:sz w:val="28"/>
-                <w:szCs w:val="28"/>
-              </w:rPr>
-            </w:r>
-          </w:p>
-        </w:tc>
-      </w:tr>
-      <w:tr>
-        <w:trPr>
-          <w:cantSplit/>
-          <w:trHeight w:val="624" w:hRule="atLeast"/>
-        </w:trPr>
-        <w:tc>
-          <w:tcPr>
-            <w:tcW w:w="481" w:type="dxa"/>
-            <w:tcBorders>
-              <w:top w:val="single" w:sz="4" w:color="C9D3DC"/>
-              <w:left w:val="single" w:sz="4" w:color="C9D3DC"/>
-              <w:bottom w:val="single" w:sz="4" w:color="C9D3DC"/>
-              <w:right w:val="single" w:sz="4" w:color="C9D3DC"/>
-            </w:tcBorders>
-            <w:shd w:val="clear" w:fill="FFFFFF"/>
-            <w:tcMar>
-              <w:top w:w="40" w:type="dxa"/>
-              <w:left w:w="90" w:type="dxa"/>
-              <w:bottom w:w="40" w:type="dxa"/>
-              <w:right w:w="90" w:type="dxa"/>
-            </w:tcMar>
-          </w:tcPr>
-          <w:p>
-            <w:pPr>
-              <w:keepNext/>
-            </w:pPr>
-            <w:r>
-              <w:rPr>
-                <w:rFonts w:ascii="TH Sarabun New" w:hAnsi="TH Sarabun New" w:eastAsia="TH Sarabun New" w:cs="TH Sarabun New"/>
-                <w:color w:val="5A6B7C"/>
-                <w:sz w:val="28"/>
-                <w:szCs w:val="28"/>
-              </w:rPr>
-              <w:t>5</w:t>
-            </w:r>
-          </w:p>
-        </w:tc>
-        <w:tc>
-          <w:tcPr>
-            <w:tcW w:w="1638" w:type="dxa"/>
-            <w:tcBorders>
-              <w:top w:val="single" w:sz="4" w:color="C9D3DC"/>
-              <w:left w:val="single" w:sz="4" w:color="C9D3DC"/>
-              <w:bottom w:val="single" w:sz="4" w:color="C9D3DC"/>
-              <w:right w:val="single" w:sz="4" w:color="C9D3DC"/>
-            </w:tcBorders>
-            <w:shd w:val="clear" w:fill="FFFFFF"/>
-            <w:tcMar>
-              <w:top w:w="40" w:type="dxa"/>
-              <w:left w:w="90" w:type="dxa"/>
-              <w:bottom w:w="40" w:type="dxa"/>
-              <w:right w:w="90" w:type="dxa"/>
-            </w:tcMar>
-          </w:tcPr>
-          <w:p>
-            <w:pPr>
-              <w:keepNext/>
-            </w:pPr>
-            <w:r>
-              <w:rPr>
-                <w:rFonts w:ascii="TH Sarabun New" w:hAnsi="TH Sarabun New" w:eastAsia="TH Sarabun New" w:cs="TH Sarabun New"/>
-                <w:b w:val="0"/>
-                <w:bCs w:val="0"/>
-                <w:i w:val="0"/>
-                <w:iCs w:val="0"/>
-                <w:color w:val="172333"/>
-                <w:sz w:val="28"/>
-                <w:szCs w:val="28"/>
-              </w:rPr>
-            </w:r>
-          </w:p>
-        </w:tc>
-        <w:tc>
-          <w:tcPr>
-            <w:tcW w:w="1638" w:type="dxa"/>
-            <w:tcBorders>
-              <w:top w:val="single" w:sz="4" w:color="C9D3DC"/>
-              <w:left w:val="single" w:sz="4" w:color="C9D3DC"/>
-              <w:bottom w:val="single" w:sz="4" w:color="C9D3DC"/>
-              <w:right w:val="single" w:sz="4" w:color="C9D3DC"/>
-            </w:tcBorders>
-            <w:shd w:val="clear" w:fill="FFFFFF"/>
-            <w:tcMar>
-              <w:top w:w="40" w:type="dxa"/>
-              <w:left w:w="90" w:type="dxa"/>
-              <w:bottom w:w="40" w:type="dxa"/>
-              <w:right w:w="90" w:type="dxa"/>
-            </w:tcMar>
-          </w:tcPr>
-          <w:p>
-            <w:pPr>
-              <w:keepNext/>
-            </w:pPr>
-            <w:r>
-              <w:rPr>
-                <w:rFonts w:ascii="TH Sarabun New" w:hAnsi="TH Sarabun New" w:eastAsia="TH Sarabun New" w:cs="TH Sarabun New"/>
-                <w:b w:val="0"/>
-                <w:bCs w:val="0"/>
-                <w:i w:val="0"/>
-                <w:iCs w:val="0"/>
-                <w:color w:val="172333"/>
-                <w:sz w:val="28"/>
-                <w:szCs w:val="28"/>
-              </w:rPr>
-            </w:r>
-          </w:p>
-        </w:tc>
-        <w:tc>
-          <w:tcPr>
-            <w:tcW w:w="1542" w:type="dxa"/>
-            <w:tcBorders>
-              <w:top w:val="single" w:sz="4" w:color="C9D3DC"/>
-              <w:left w:val="single" w:sz="4" w:color="C9D3DC"/>
-              <w:bottom w:val="single" w:sz="4" w:color="C9D3DC"/>
-              <w:right w:val="single" w:sz="4" w:color="C9D3DC"/>
-            </w:tcBorders>
-            <w:shd w:val="clear" w:fill="FFFFFF"/>
-            <w:tcMar>
-              <w:top w:w="40" w:type="dxa"/>
-              <w:left w:w="90" w:type="dxa"/>
-              <w:bottom w:w="40" w:type="dxa"/>
-              <w:right w:w="90" w:type="dxa"/>
-            </w:tcMar>
-          </w:tcPr>
-          <w:p>
-            <w:pPr>
-              <w:keepNext/>
-            </w:pPr>
-            <w:r>
-              <w:rPr>
-                <w:rFonts w:ascii="TH Sarabun New" w:hAnsi="TH Sarabun New" w:eastAsia="TH Sarabun New" w:cs="TH Sarabun New"/>
-                <w:b w:val="0"/>
-                <w:bCs w:val="0"/>
-                <w:i w:val="0"/>
-                <w:iCs w:val="0"/>
-                <w:color w:val="172333"/>
-                <w:sz w:val="28"/>
-                <w:szCs w:val="28"/>
-              </w:rPr>
-            </w:r>
-          </w:p>
-        </w:tc>
-        <w:tc>
-          <w:tcPr>
-            <w:tcW w:w="1156" w:type="dxa"/>
-            <w:tcBorders>
-              <w:top w:val="single" w:sz="4" w:color="C9D3DC"/>
-              <w:left w:val="single" w:sz="4" w:color="C9D3DC"/>
-              <w:bottom w:val="single" w:sz="4" w:color="C9D3DC"/>
-              <w:right w:val="single" w:sz="4" w:color="C9D3DC"/>
-            </w:tcBorders>
-            <w:shd w:val="clear" w:fill="FFFFFF"/>
-            <w:tcMar>
-              <w:top w:w="40" w:type="dxa"/>
-              <w:left w:w="90" w:type="dxa"/>
-              <w:bottom w:w="40" w:type="dxa"/>
-              <w:right w:w="90" w:type="dxa"/>
-            </w:tcMar>
-          </w:tcPr>
-          <w:p>
-            <w:pPr>
-              <w:keepNext/>
-            </w:pPr>
-            <w:r>
-              <w:rPr>
-                <w:rFonts w:ascii="TH Sarabun New" w:hAnsi="TH Sarabun New" w:eastAsia="TH Sarabun New" w:cs="TH Sarabun New"/>
-                <w:b w:val="0"/>
-                <w:bCs w:val="0"/>
-                <w:i w:val="0"/>
-                <w:iCs w:val="0"/>
-                <w:color w:val="172333"/>
-                <w:sz w:val="28"/>
-                <w:szCs w:val="28"/>
-              </w:rPr>
-            </w:r>
-          </w:p>
-        </w:tc>
-        <w:tc>
-          <w:tcPr>
-            <w:tcW w:w="1831" w:type="dxa"/>
-            <w:tcBorders>
-              <w:top w:val="single" w:sz="4" w:color="C9D3DC"/>
-              <w:left w:val="single" w:sz="4" w:color="C9D3DC"/>
-              <w:bottom w:val="single" w:sz="4" w:color="C9D3DC"/>
-              <w:right w:val="single" w:sz="4" w:color="C9D3DC"/>
-            </w:tcBorders>
-            <w:shd w:val="clear" w:fill="FFFFFF"/>
-            <w:tcMar>
-              <w:top w:w="40" w:type="dxa"/>
-              <w:left w:w="90" w:type="dxa"/>
-              <w:bottom w:w="40" w:type="dxa"/>
-              <w:right w:w="90" w:type="dxa"/>
-            </w:tcMar>
-          </w:tcPr>
-          <w:p>
-            <w:pPr>
-              <w:keepNext/>
-            </w:pPr>
-            <w:r>
-              <w:rPr>
-                <w:rFonts w:ascii="TH Sarabun New" w:hAnsi="TH Sarabun New" w:eastAsia="TH Sarabun New" w:cs="TH Sarabun New"/>
-                <w:b w:val="0"/>
-                <w:bCs w:val="0"/>
-                <w:i w:val="0"/>
-                <w:iCs w:val="0"/>
-                <w:color w:val="172333"/>
-                <w:sz w:val="28"/>
-                <w:szCs w:val="28"/>
-              </w:rPr>
-            </w:r>
-          </w:p>
-        </w:tc>
-        <w:tc>
-          <w:tcPr>
-            <w:tcW w:w="1352" w:type="dxa"/>
-            <w:tcBorders>
-              <w:top w:val="single" w:sz="4" w:color="C9D3DC"/>
-              <w:left w:val="single" w:sz="4" w:color="C9D3DC"/>
-              <w:bottom w:val="single" w:sz="4" w:color="C9D3DC"/>
-              <w:right w:val="single" w:sz="4" w:color="C9D3DC"/>
-            </w:tcBorders>
-            <w:shd w:val="clear" w:fill="FFFFFF"/>
-            <w:tcMar>
-              <w:top w:w="40" w:type="dxa"/>
-              <w:left w:w="90" w:type="dxa"/>
-              <w:bottom w:w="40" w:type="dxa"/>
-              <w:right w:w="90" w:type="dxa"/>
-            </w:tcMar>
-          </w:tcPr>
-          <w:p>
-            <w:pPr>
-              <w:keepNext/>
-            </w:pPr>
-            <w:r>
-              <w:rPr>
-                <w:rFonts w:ascii="TH Sarabun New" w:hAnsi="TH Sarabun New" w:eastAsia="TH Sarabun New" w:cs="TH Sarabun New"/>
-                <w:b w:val="0"/>
-                <w:bCs w:val="0"/>
-                <w:i w:val="0"/>
-                <w:iCs w:val="0"/>
-                <w:color w:val="172333"/>
-                <w:sz w:val="28"/>
-                <w:szCs w:val="28"/>
-              </w:rPr>
-            </w:r>
-          </w:p>
-        </w:tc>
-      </w:tr>
-      <w:tr>
-        <w:trPr>
-          <w:cantSplit/>
-          <w:trHeight w:val="624" w:hRule="atLeast"/>
-        </w:trPr>
-        <w:tc>
-          <w:tcPr>
-            <w:tcW w:w="481" w:type="dxa"/>
-            <w:tcBorders>
-              <w:top w:val="single" w:sz="4" w:color="C9D3DC"/>
-              <w:left w:val="single" w:sz="4" w:color="C9D3DC"/>
-              <w:bottom w:val="single" w:sz="4" w:color="C9D3DC"/>
-              <w:right w:val="single" w:sz="4" w:color="C9D3DC"/>
-            </w:tcBorders>
-            <w:shd w:val="clear" w:fill="F1F7FA"/>
-            <w:tcMar>
-              <w:top w:w="40" w:type="dxa"/>
-              <w:left w:w="90" w:type="dxa"/>
-              <w:bottom w:w="40" w:type="dxa"/>
-              <w:right w:w="90" w:type="dxa"/>
-            </w:tcMar>
-          </w:tcPr>
-          <w:p>
-            <w:pPr>
-              <w:keepNext w:val="0"/>
-            </w:pPr>
-            <w:r>
-              <w:rPr>
-                <w:rFonts w:ascii="TH Sarabun New" w:hAnsi="TH Sarabun New" w:eastAsia="TH Sarabun New" w:cs="TH Sarabun New"/>
-                <w:color w:val="5A6B7C"/>
-                <w:sz w:val="28"/>
-                <w:szCs w:val="28"/>
-              </w:rPr>
-              <w:t>6</w:t>
-            </w:r>
-          </w:p>
-        </w:tc>
-        <w:tc>
-          <w:tcPr>
-            <w:tcW w:w="1638" w:type="dxa"/>
-            <w:tcBorders>
-              <w:top w:val="single" w:sz="4" w:color="C9D3DC"/>
-              <w:left w:val="single" w:sz="4" w:color="C9D3DC"/>
-              <w:bottom w:val="single" w:sz="4" w:color="C9D3DC"/>
-              <w:right w:val="single" w:sz="4" w:color="C9D3DC"/>
-            </w:tcBorders>
-            <w:shd w:val="clear" w:fill="F1F7FA"/>
-            <w:tcMar>
-              <w:top w:w="40" w:type="dxa"/>
-              <w:left w:w="90" w:type="dxa"/>
-              <w:bottom w:w="40" w:type="dxa"/>
-              <w:right w:w="90" w:type="dxa"/>
-            </w:tcMar>
-          </w:tcPr>
-          <w:p>
-            <w:pPr>
-              <w:keepNext w:val="0"/>
-            </w:pPr>
-            <w:r>
-              <w:rPr>
-                <w:rFonts w:ascii="TH Sarabun New" w:hAnsi="TH Sarabun New" w:eastAsia="TH Sarabun New" w:cs="TH Sarabun New"/>
-                <w:b w:val="0"/>
-                <w:bCs w:val="0"/>
-                <w:i w:val="0"/>
-                <w:iCs w:val="0"/>
-                <w:color w:val="172333"/>
-                <w:sz w:val="28"/>
-                <w:szCs w:val="28"/>
-              </w:rPr>
-            </w:r>
-          </w:p>
-        </w:tc>
-        <w:tc>
-          <w:tcPr>
-            <w:tcW w:w="1638" w:type="dxa"/>
-            <w:tcBorders>
-              <w:top w:val="single" w:sz="4" w:color="C9D3DC"/>
-              <w:left w:val="single" w:sz="4" w:color="C9D3DC"/>
-              <w:bottom w:val="single" w:sz="4" w:color="C9D3DC"/>
-              <w:right w:val="single" w:sz="4" w:color="C9D3DC"/>
-            </w:tcBorders>
-            <w:shd w:val="clear" w:fill="F1F7FA"/>
-            <w:tcMar>
-              <w:top w:w="40" w:type="dxa"/>
-              <w:left w:w="90" w:type="dxa"/>
-              <w:bottom w:w="40" w:type="dxa"/>
-              <w:right w:w="90" w:type="dxa"/>
-            </w:tcMar>
-          </w:tcPr>
-          <w:p>
-            <w:pPr>
-              <w:keepNext w:val="0"/>
-            </w:pPr>
-            <w:r>
-              <w:rPr>
-                <w:rFonts w:ascii="TH Sarabun New" w:hAnsi="TH Sarabun New" w:eastAsia="TH Sarabun New" w:cs="TH Sarabun New"/>
-                <w:b w:val="0"/>
-                <w:bCs w:val="0"/>
-                <w:i w:val="0"/>
-                <w:iCs w:val="0"/>
-                <w:color w:val="172333"/>
-                <w:sz w:val="28"/>
-                <w:szCs w:val="28"/>
-              </w:rPr>
-            </w:r>
-          </w:p>
-        </w:tc>
-        <w:tc>
-          <w:tcPr>
-            <w:tcW w:w="1542" w:type="dxa"/>
-            <w:tcBorders>
-              <w:top w:val="single" w:sz="4" w:color="C9D3DC"/>
-              <w:left w:val="single" w:sz="4" w:color="C9D3DC"/>
-              <w:bottom w:val="single" w:sz="4" w:color="C9D3DC"/>
-              <w:right w:val="single" w:sz="4" w:color="C9D3DC"/>
-            </w:tcBorders>
-            <w:shd w:val="clear" w:fill="F1F7FA"/>
-            <w:tcMar>
-              <w:top w:w="40" w:type="dxa"/>
-              <w:left w:w="90" w:type="dxa"/>
-              <w:bottom w:w="40" w:type="dxa"/>
-              <w:right w:w="90" w:type="dxa"/>
-            </w:tcMar>
-          </w:tcPr>
-          <w:p>
-            <w:pPr>
-              <w:keepNext w:val="0"/>
-            </w:pPr>
-            <w:r>
-              <w:rPr>
-                <w:rFonts w:ascii="TH Sarabun New" w:hAnsi="TH Sarabun New" w:eastAsia="TH Sarabun New" w:cs="TH Sarabun New"/>
-                <w:b w:val="0"/>
-                <w:bCs w:val="0"/>
-                <w:i w:val="0"/>
-                <w:iCs w:val="0"/>
-                <w:color w:val="172333"/>
-                <w:sz w:val="28"/>
-                <w:szCs w:val="28"/>
-              </w:rPr>
-            </w:r>
-          </w:p>
-        </w:tc>
-        <w:tc>
-          <w:tcPr>
-            <w:tcW w:w="1156" w:type="dxa"/>
-            <w:tcBorders>
-              <w:top w:val="single" w:sz="4" w:color="C9D3DC"/>
-              <w:left w:val="single" w:sz="4" w:color="C9D3DC"/>
-              <w:bottom w:val="single" w:sz="4" w:color="C9D3DC"/>
-              <w:right w:val="single" w:sz="4" w:color="C9D3DC"/>
-            </w:tcBorders>
-            <w:shd w:val="clear" w:fill="F1F7FA"/>
-            <w:tcMar>
-              <w:top w:w="40" w:type="dxa"/>
-              <w:left w:w="90" w:type="dxa"/>
-              <w:bottom w:w="40" w:type="dxa"/>
-              <w:right w:w="90" w:type="dxa"/>
-            </w:tcMar>
-          </w:tcPr>
-          <w:p>
-            <w:pPr>
-              <w:keepNext w:val="0"/>
-            </w:pPr>
-            <w:r>
-              <w:rPr>
-                <w:rFonts w:ascii="TH Sarabun New" w:hAnsi="TH Sarabun New" w:eastAsia="TH Sarabun New" w:cs="TH Sarabun New"/>
-                <w:b w:val="0"/>
-                <w:bCs w:val="0"/>
-                <w:i w:val="0"/>
-                <w:iCs w:val="0"/>
-                <w:color w:val="172333"/>
-                <w:sz w:val="28"/>
-                <w:szCs w:val="28"/>
-              </w:rPr>
-            </w:r>
-          </w:p>
-        </w:tc>
-        <w:tc>
-          <w:tcPr>
-            <w:tcW w:w="1831" w:type="dxa"/>
-            <w:tcBorders>
-              <w:top w:val="single" w:sz="4" w:color="C9D3DC"/>
-              <w:left w:val="single" w:sz="4" w:color="C9D3DC"/>
-              <w:bottom w:val="single" w:sz="4" w:color="C9D3DC"/>
-              <w:right w:val="single" w:sz="4" w:color="C9D3DC"/>
-            </w:tcBorders>
-            <w:shd w:val="clear" w:fill="F1F7FA"/>
-            <w:tcMar>
-              <w:top w:w="40" w:type="dxa"/>
-              <w:left w:w="90" w:type="dxa"/>
-              <w:bottom w:w="40" w:type="dxa"/>
-              <w:right w:w="90" w:type="dxa"/>
-            </w:tcMar>
-          </w:tcPr>
-          <w:p>
-            <w:pPr>
-              <w:keepNext w:val="0"/>
-            </w:pPr>
-            <w:r>
-              <w:rPr>
-                <w:rFonts w:ascii="TH Sarabun New" w:hAnsi="TH Sarabun New" w:eastAsia="TH Sarabun New" w:cs="TH Sarabun New"/>
-                <w:b w:val="0"/>
-                <w:bCs w:val="0"/>
-                <w:i w:val="0"/>
-                <w:iCs w:val="0"/>
-                <w:color w:val="172333"/>
-                <w:sz w:val="28"/>
-                <w:szCs w:val="28"/>
-              </w:rPr>
-            </w:r>
-          </w:p>
-        </w:tc>
-        <w:tc>
-          <w:tcPr>
-            <w:tcW w:w="1352" w:type="dxa"/>
-            <w:tcBorders>
-              <w:top w:val="single" w:sz="4" w:color="C9D3DC"/>
-              <w:left w:val="single" w:sz="4" w:color="C9D3DC"/>
-              <w:bottom w:val="single" w:sz="4" w:color="C9D3DC"/>
-              <w:right w:val="single" w:sz="4" w:color="C9D3DC"/>
-            </w:tcBorders>
-            <w:shd w:val="clear" w:fill="F1F7FA"/>
-            <w:tcMar>
-              <w:top w:w="40" w:type="dxa"/>
-              <w:left w:w="90" w:type="dxa"/>
-              <w:bottom w:w="40" w:type="dxa"/>
-              <w:right w:w="90" w:type="dxa"/>
-            </w:tcMar>
-          </w:tcPr>
-          <w:p>
-            <w:pPr>
-              <w:keepNext w:val="0"/>
-            </w:pPr>
-            <w:r>
-              <w:rPr>
-                <w:rFonts w:ascii="TH Sarabun New" w:hAnsi="TH Sarabun New" w:eastAsia="TH Sarabun New" w:cs="TH Sarabun New"/>
-                <w:b w:val="0"/>
-                <w:bCs w:val="0"/>
-                <w:i w:val="0"/>
-                <w:iCs w:val="0"/>
-                <w:color w:val="172333"/>
-                <w:sz w:val="28"/>
-                <w:szCs w:val="28"/>
-              </w:rPr>
+            <w:r>
+              <w:t>ไม่กระทบ (คงลำดับ FIFO เดิม)</w:t>
             </w:r>
           </w:p>
         </w:tc>
@@ -3288,7 +2772,7 @@
                 <w:sz w:val="28"/>
                 <w:szCs w:val="28"/>
               </w:rPr>
-              <w:t>US-</w:t>
+              <w:t>US-12</w:t>
             </w:r>
           </w:p>
         </w:tc>
@@ -3315,15 +2799,12 @@
             </w:pPr>
             <w:r>
               <w:rPr>
-                <w:rFonts w:ascii="TH Sarabun New" w:hAnsi="TH Sarabun New" w:eastAsia="TH Sarabun New" w:cs="TH Sarabun New"/>
-                <w:b w:val="0"/>
-                <w:bCs w:val="0"/>
-                <w:i w:val="0"/>
-                <w:iCs w:val="0"/>
-                <w:color w:val="172333"/>
-                <w:sz w:val="28"/>
-                <w:szCs w:val="28"/>
-              </w:rPr>
+                <w:rFonts w:ascii="TH Sarabun New" w:hAnsi="TH Sarabun New" w:cs="TH Sarabun New"/>
+                <w:color w:val="172333"/>
+                <w:sz w:val="32"/>
+                <w:szCs w:val="32"/>
+              </w:rPr>
+              <w:t>ในฐานะลูกค้า ฉันต้องการได้รับแจ้งเมื่อสถานะออเดอร์ของฉันเปลี่ยน เพื่อดูความคืบหน้าโดยไม่ต้องถามพนักงาน</w:t>
             </w:r>
           </w:p>
         </w:tc>
@@ -3431,7 +2912,7 @@
                 <w:sz w:val="28"/>
                 <w:szCs w:val="28"/>
               </w:rPr>
-              <w:t>US-</w:t>
+              <w:t>US-13</w:t>
             </w:r>
           </w:p>
         </w:tc>
@@ -3574,7 +3055,7 @@
                 <w:sz w:val="28"/>
                 <w:szCs w:val="28"/>
               </w:rPr>
-              <w:t>US-</w:t>
+              <w:t>US-14</w:t>
             </w:r>
           </w:p>
         </w:tc>

</xml_diff>

<commit_message>
fix: G1 , G3
</commit_message>
<xml_diff>
--- a/final-exam/ENGSE206_Final_PartA_GroupAnswer_Template_v1.0.docx
+++ b/final-exam/ENGSE206_Final_PartA_GroupAnswer_Template_v1.0.docx
@@ -722,7 +722,7 @@
                 <w:sz w:val="28"/>
                 <w:szCs w:val="28"/>
               </w:rPr>
-              <w:t>3. ลูกค้าเลือก opt-in รับแจ้งผ่านช่องทางภายนอก และข้อความมีข้อมูลส่วนบุคคลเท่าที่จำเป็น</w:t>
+              <w:t>3. ผู้ใช้เลือกได้ว่าจะรับแจ้งเตือนผ่าน ช่องทางแจ้งเตือนภายนอกหรือไม่ (opt-in) และข้อความห้ามมีข้อมูลส่วนบุคคลเกินจำเป็น</w:t>
             </w:r>
           </w:p>
         </w:tc>
@@ -7062,7 +7062,7 @@
                 <w:sz w:val="28"/>
                 <w:szCs w:val="28"/>
               </w:rPr>
-              <w:t>ต่อยอด UC-01/UC-02 และ FR-01 FR-07</w:t>
+              <w:t>ต่อยอด FR-01, UC-01/UC-02 และเพิ่ม FR-07/BR-02 ต้องบันทึกสถานะสำเร็จก่อนสร้างการแจ้งเตือน ส่วนการเปิดส่งผ่าน EXT-01 ยังขึ้นกับ OI-FX-01 และการยืนยันนโยบาย</w:t>
             </w:r>
           </w:p>
         </w:tc>
@@ -7164,7 +7164,7 @@
                 <w:sz w:val="28"/>
                 <w:szCs w:val="28"/>
               </w:rPr>
-              <w:t>R-08/DR-02 มีฐานเวลา แต่สถานะที่เข้าเงื่อนไขและ threshold ยังไม่ตกลง (OI-06)</w:t>
+              <w:t>FR-08 และ DR-01/DR-02 ต้องใช้สถานะ/เวลาออเดอร์ แต่เกณฑ์ค้าง สถานะที่เข้าเงื่อนไข และรอบเตือนยังไม่ตกลง</w:t>
             </w:r>
           </w:p>
         </w:tc>
@@ -7234,7 +7234,7 @@
                 <w:sz w:val="28"/>
                 <w:szCs w:val="28"/>
               </w:rPr>
-              <w:t xml:space="preserve">Build now </w:t>
+              <w:t>Later</w:t>
             </w:r>
           </w:p>
         </w:tc>
@@ -7266,7 +7266,7 @@
                 <w:sz w:val="28"/>
                 <w:szCs w:val="28"/>
               </w:rPr>
-              <w:t>เป็นเงื่อนไขความยินยอมสำหรับการแจ้งเตือนภายนอก (BR-02, NFR-02, NFR-04)</w:t>
+              <w:t>สอดคล้องกับข้อเสนอทางเลือก 1 ใน G1 ที่เลื่อนสองความสามารถนี้ออกจากรุ่นปัจจุบัน</w:t>
             </w:r>
           </w:p>
         </w:tc>
@@ -7368,7 +7368,7 @@
                 <w:sz w:val="28"/>
                 <w:szCs w:val="28"/>
               </w:rPr>
-              <w:t xml:space="preserve">EXT-01 เป็น Extension provider, protocol และ delivery/retry behavior ยัง TBD (OI 05/OI-07) </w:t>
+              <w:t>คง EXT-01 เป็น external ยังไม่เลือกผู้ให้บริการ protocol, retry หรือเกณฑ์ delivery</w:t>
             </w:r>
           </w:p>
         </w:tc>
@@ -7595,7 +7595,7 @@
                 <w:sz w:val="28"/>
                 <w:szCs w:val="28"/>
               </w:rPr>
-              <w:t>ต้องคงกฎเดิม ห้ามข้ามกฎยกเลิก</w:t>
+              <w:t>การแจ้งเตือนต้องเกิดหลังการเปลี่ยนสถานะที่ถูกกติกาเท่านั้นหากคำขอยกเลิกถูกปฏิเสธเพราะออเดอร์เป็น “กำลังทำ” ห้ามแจ้งว่าการเปลี่ยนสำเร็จ</w:t>
             </w:r>
           </w:p>
         </w:tc>
@@ -7697,7 +7697,7 @@
                 <w:sz w:val="28"/>
                 <w:szCs w:val="28"/>
               </w:rPr>
-              <w:t>ไม่เปลี่ยนลำดับคิว การแจ้งเตือนหรือสแกน QR ต้องไม่ย้ายคิวเอง</w:t>
+              <w:t>การตรวจออเดอร์ค้างหรือส่งแจ้งเตือนต้องไม่เปลี่ยนลำดับ FIFO และไม่แก้คิวเอง</w:t>
             </w:r>
           </w:p>
         </w:tc>
@@ -7831,7 +7831,7 @@
                 <w:sz w:val="28"/>
                 <w:szCs w:val="28"/>
               </w:rPr>
-              <w:t>API → Database transaction → event/response client แสดงผลสำเร็จเมื่อได้ผลยืนยัน</w:t>
+              <w:t>API ตรวจสิทธิ์/กฎแล้วเขียน Database ใน transaction</w:t>
             </w:r>
           </w:p>
         </w:tc>
@@ -7894,7 +7894,7 @@
                 <w:sz w:val="28"/>
                 <w:szCs w:val="28"/>
               </w:rPr>
-              <w:t>เพิ่ม preference การแจ้งเตือนและจำกัด payload ภายนอก</w:t>
+              <w:t>แม้ข้อเสนอ G1 จะเลื่อน opt-in ออกนอก scope รุ่นนี้ แต่ข้อห้ามจัดเก็บประวัติแพ้อาหารตาม NFR-02 เดิม</w:t>
             </w:r>
           </w:p>
         </w:tc>
@@ -7920,36 +7920,15 @@
               <w:rPr>
                 <w:rFonts w:ascii="TH Sarabun New" w:hAnsi="TH Sarabun New" w:eastAsia="TH Sarabun New" w:cs="TH Sarabun New"/>
                 <w:color w:val="172333"/>
-                <w:sz w:val="32"/>
-                <w:szCs w:val="32"/>
-              </w:rPr>
-              <w:t>API ตรวจ opt-in ทุกครั้ง DB เก็บ preference ขั้นต่ำ EXT-01 รับเฉพาะ payload ที่จำเป็น</w:t>
+                <w:sz w:val="28"/>
+                <w:szCs w:val="28"/>
+              </w:rPr>
+              <w:t>ห้ามเพิ่ม field เก็บข้อมูลสุขภาพ คง contract ของ EXT-01 แบบนามธรรมและส่งเฉพาะข้อมูลจำเป็นที่ได้รับอนุมัติ</w:t>
             </w:r>
           </w:p>
         </w:tc>
       </w:tr>
     </w:tbl>
-    <w:p>
-      <w:pPr>
-        <w:spacing w:after="120"/>
-      </w:pPr>
-      <w:r>
-        <w:rPr>
-          <w:sz w:val="4"/>
-          <w:szCs w:val="4"/>
-        </w:rPr>
-      </w:r>
-    </w:p>
-    <w:p>
-      <w:pPr>
-        <w:spacing w:after="120"/>
-      </w:pPr>
-    </w:p>
-    <w:p>
-      <w:pPr>
-        <w:spacing w:after="120"/>
-      </w:pPr>
-    </w:p>
     <w:p>
       <w:pPr>
         <w:spacing w:after="120"/>
@@ -8876,7 +8855,16 @@
                 <w:sz w:val="32"/>
                 <w:szCs w:val="32"/>
               </w:rPr>
-              <w:t>ลูกค้าเปิดหรือปิดการแจ้งเตือน</w:t>
+              <w:t>ตั</w:t>
+            </w:r>
+            <w:r>
+              <w:rPr>
+                <w:rFonts w:ascii="TH Sarabun New" w:hAnsi="TH Sarabun New" w:eastAsia="TH Sarabun New" w:cs="TH Sarabun New"/>
+                <w:color w:val="172333"/>
+                <w:sz w:val="28"/>
+                <w:szCs w:val="28"/>
+              </w:rPr>
+              <w:t>้งค่า opt-in/opt-out และ payloa</w:t>
             </w:r>
           </w:p>
         </w:tc>
@@ -8902,10 +8890,10 @@
               <w:rPr>
                 <w:rFonts w:ascii="TH Sarabun New" w:hAnsi="TH Sarabun New" w:eastAsia="TH Sarabun New" w:cs="TH Sarabun New"/>
                 <w:color w:val="172333"/>
-                <w:sz w:val="32"/>
-                <w:szCs w:val="32"/>
-              </w:rPr>
-              <w:t>UC-01</w:t>
+                <w:sz w:val="28"/>
+                <w:szCs w:val="28"/>
+              </w:rPr>
+              <w:t>TBD</w:t>
             </w:r>
           </w:p>
         </w:tc>
@@ -8931,10 +8919,10 @@
               <w:rPr>
                 <w:rFonts w:ascii="TH Sarabun New" w:hAnsi="TH Sarabun New" w:eastAsia="TH Sarabun New" w:cs="TH Sarabun New"/>
                 <w:color w:val="172333"/>
-                <w:sz w:val="32"/>
-                <w:szCs w:val="32"/>
-              </w:rPr>
-              <w:t>Build now</w:t>
+                <w:sz w:val="28"/>
+                <w:szCs w:val="28"/>
+              </w:rPr>
+              <w:t xml:space="preserve">Later </w:t>
             </w:r>
           </w:p>
         </w:tc>
@@ -8960,8 +8948,8 @@
               <w:rPr>
                 <w:rFonts w:ascii="TH Sarabun New" w:hAnsi="TH Sarabun New" w:eastAsia="TH Sarabun New" w:cs="TH Sarabun New"/>
                 <w:color w:val="172333"/>
-                <w:sz w:val="32"/>
-                <w:szCs w:val="32"/>
+                <w:sz w:val="28"/>
+                <w:szCs w:val="28"/>
               </w:rPr>
               <w:t>Mobile Application → API Application → Database</w:t>
             </w:r>
@@ -8989,10 +8977,10 @@
               <w:rPr>
                 <w:rFonts w:ascii="TH Sarabun New" w:hAnsi="TH Sarabun New" w:eastAsia="TH Sarabun New" w:cs="TH Sarabun New"/>
                 <w:color w:val="172333"/>
-                <w:sz w:val="32"/>
-                <w:szCs w:val="32"/>
-              </w:rPr>
-              <w:t>เก็บ preference API เป็น enforce ไม่พึ่งค่า client เพียงอย่างเดียว</w:t>
+                <w:sz w:val="28"/>
+                <w:szCs w:val="28"/>
+              </w:rPr>
+              <w:t>เลื่อนตาม G1 ยังไม่เพิ่ม</w:t>
             </w:r>
           </w:p>
         </w:tc>
@@ -9002,12 +8990,6 @@
       <w:pPr>
         <w:spacing w:after="120"/>
       </w:pPr>
-      <w:r>
-        <w:rPr>
-          <w:sz w:val="4"/>
-          <w:szCs w:val="4"/>
-        </w:rPr>
-      </w:r>
     </w:p>
     <w:p>
       <w:pPr>
@@ -9623,7 +9605,7 @@
                 <w:sz w:val="28"/>
                 <w:szCs w:val="28"/>
               </w:rPr>
-              <w:t>Payload, preference และ retention</w:t>
+              <w:t>Opt-in และ payload ของข้อความภายนอก</w:t>
             </w:r>
           </w:p>
         </w:tc>
@@ -9687,7 +9669,7 @@
                 <w:sz w:val="28"/>
                 <w:szCs w:val="28"/>
               </w:rPr>
-              <w:t>ส่งข้อมูลขั้นต่ำเท่านั้น ห้ามเก็บข้อมูลสุขภาพ</w:t>
+              <w:t>ตาม G1 เลื่อน preference NFR-02 ยังห้ามเก็บประวัติแพ้อาหาร รอยืนยัน payload/policy</w:t>
             </w:r>
           </w:p>
         </w:tc>
@@ -9840,7 +9822,7 @@
                 <w:sz w:val="28"/>
                 <w:szCs w:val="28"/>
               </w:rPr>
-              <w:t>ไม่ mark รับอาหารสำเร็จแบบ local-only แสดงผลตรวจไม่ได้และให้ retry/ถามพนักงานตามขั้นตอนที่อนุมัติภายหลัง</w:t>
+              <w:t>ห้ามยืนยันรับแบบ local-only แสดงว่าตรวจไม่ได้ ให้ retry fallback รออนุมัติ</w:t>
             </w:r>
           </w:p>
         </w:tc>
@@ -13095,7 +13077,7 @@
             </w:pPr>
             <w:r>
               <w:rPr>
-                <w:rFonts w:ascii="TH Sarabun New" w:hAnsi="TH Sarabun New" w:cs="TH Sarabun New"/>
+                <w:rFonts w:ascii="TH Sarabun New" w:hAnsi="TH Sarabun New" w:eastAsia="TH Sarabun New" w:cs="TH Sarabun New"/>
                 <w:color w:val="172333"/>
                 <w:sz w:val="28"/>
                 <w:szCs w:val="28"/>
@@ -13168,7 +13150,7 @@
             </w:pPr>
             <w:r>
               <w:rPr>
-                <w:rFonts w:ascii="TH Sarabun New" w:hAnsi="TH Sarabun New" w:cs="TH Sarabun New"/>
+                <w:rFonts w:ascii="TH Sarabun New" w:hAnsi="TH Sarabun New" w:eastAsia="TH Sarabun New" w:cs="TH Sarabun New"/>
                 <w:color w:val="172333"/>
                 <w:sz w:val="28"/>
                 <w:szCs w:val="28"/>
@@ -13241,7 +13223,7 @@
             </w:pPr>
             <w:r>
               <w:rPr>
-                <w:rFonts w:ascii="TH Sarabun New" w:hAnsi="TH Sarabun New" w:cs="TH Sarabun New"/>
+                <w:rFonts w:ascii="TH Sarabun New" w:hAnsi="TH Sarabun New" w:eastAsia="TH Sarabun New" w:cs="TH Sarabun New"/>
                 <w:color w:val="172333"/>
                 <w:sz w:val="28"/>
                 <w:szCs w:val="28"/>
@@ -13256,7 +13238,7 @@
             </w:pPr>
             <w:r>
               <w:rPr>
-                <w:rFonts w:ascii="TH Sarabun New" w:hAnsi="TH Sarabun New" w:cs="TH Sarabun New"/>
+                <w:rFonts w:ascii="TH Sarabun New" w:hAnsi="TH Sarabun New" w:eastAsia="TH Sarabun New" w:cs="TH Sarabun New"/>
                 <w:color w:val="172333"/>
                 <w:sz w:val="28"/>
                 <w:szCs w:val="28"/>
@@ -13329,7 +13311,7 @@
             </w:pPr>
             <w:r>
               <w:rPr>
-                <w:rFonts w:ascii="TH Sarabun New" w:hAnsi="TH Sarabun New" w:cs="TH Sarabun New"/>
+                <w:rFonts w:ascii="TH Sarabun New" w:hAnsi="TH Sarabun New" w:eastAsia="TH Sarabun New" w:cs="TH Sarabun New"/>
                 <w:color w:val="172333"/>
                 <w:sz w:val="28"/>
                 <w:szCs w:val="28"/>
@@ -13511,7 +13493,7 @@
             </w:pPr>
             <w:r>
               <w:rPr>
-                <w:rFonts w:ascii="TH Sarabun New" w:hAnsi="TH Sarabun New" w:cs="TH Sarabun New"/>
+                <w:rFonts w:ascii="TH Sarabun New" w:hAnsi="TH Sarabun New" w:eastAsia="TH Sarabun New" w:cs="TH Sarabun New"/>
                 <w:color w:val="172333"/>
                 <w:sz w:val="28"/>
                 <w:szCs w:val="28"/>
@@ -13584,7 +13566,7 @@
             </w:pPr>
             <w:r>
               <w:rPr>
-                <w:rFonts w:ascii="TH Sarabun New" w:hAnsi="TH Sarabun New" w:cs="TH Sarabun New"/>
+                <w:rFonts w:ascii="TH Sarabun New" w:hAnsi="TH Sarabun New" w:eastAsia="TH Sarabun New" w:cs="TH Sarabun New"/>
                 <w:color w:val="172333"/>
                 <w:sz w:val="28"/>
                 <w:szCs w:val="28"/>
@@ -13657,7 +13639,7 @@
             </w:pPr>
             <w:r>
               <w:rPr>
-                <w:rFonts w:ascii="TH Sarabun New" w:hAnsi="TH Sarabun New" w:cs="TH Sarabun New"/>
+                <w:rFonts w:ascii="TH Sarabun New" w:hAnsi="TH Sarabun New" w:eastAsia="TH Sarabun New" w:cs="TH Sarabun New"/>
                 <w:color w:val="172333"/>
                 <w:sz w:val="28"/>
                 <w:szCs w:val="28"/>
@@ -13730,7 +13712,7 @@
             </w:pPr>
             <w:r>
               <w:rPr>
-                <w:rFonts w:ascii="TH Sarabun New" w:hAnsi="TH Sarabun New" w:cs="TH Sarabun New"/>
+                <w:rFonts w:ascii="TH Sarabun New" w:hAnsi="TH Sarabun New" w:eastAsia="TH Sarabun New" w:cs="TH Sarabun New"/>
                 <w:color w:val="172333"/>
                 <w:sz w:val="28"/>
                 <w:szCs w:val="28"/>
@@ -13751,16 +13733,6 @@
           <w:szCs w:val="4"/>
         </w:rPr>
       </w:r>
-    </w:p>
-    <w:p>
-      <w:pPr>
-        <w:spacing w:after="140"/>
-      </w:pPr>
-    </w:p>
-    <w:p>
-      <w:pPr>
-        <w:spacing w:after="140"/>
-      </w:pPr>
     </w:p>
     <w:p>
       <w:pPr>
@@ -14033,7 +14005,7 @@
             </w:pPr>
             <w:r>
               <w:rPr>
-                <w:rFonts w:ascii="TH Sarabun New" w:hAnsi="TH Sarabun New" w:cs="TH Sarabun New"/>
+                <w:rFonts w:ascii="TH Sarabun New" w:hAnsi="TH Sarabun New" w:eastAsia="TH Sarabun New" w:cs="TH Sarabun New"/>
                 <w:color w:val="172333"/>
                 <w:sz w:val="28"/>
                 <w:szCs w:val="28"/>
@@ -14065,7 +14037,7 @@
             </w:pPr>
             <w:r>
               <w:rPr>
-                <w:rFonts w:ascii="TH Sarabun New" w:hAnsi="TH Sarabun New" w:cs="TH Sarabun New"/>
+                <w:rFonts w:ascii="TH Sarabun New" w:hAnsi="TH Sarabun New" w:eastAsia="TH Sarabun New" w:cs="TH Sarabun New"/>
                 <w:color w:val="172333"/>
                 <w:sz w:val="28"/>
                 <w:szCs w:val="28"/>
@@ -14097,7 +14069,7 @@
             </w:pPr>
             <w:r>
               <w:rPr>
-                <w:rFonts w:ascii="TH Sarabun New" w:hAnsi="TH Sarabun New" w:cs="TH Sarabun New"/>
+                <w:rFonts w:ascii="TH Sarabun New" w:hAnsi="TH Sarabun New" w:eastAsia="TH Sarabun New" w:cs="TH Sarabun New"/>
                 <w:color w:val="172333"/>
                 <w:sz w:val="28"/>
                 <w:szCs w:val="28"/>
@@ -14167,7 +14139,7 @@
             </w:pPr>
             <w:r>
               <w:rPr>
-                <w:rFonts w:ascii="TH Sarabun New" w:hAnsi="TH Sarabun New" w:cs="TH Sarabun New"/>
+                <w:rFonts w:ascii="TH Sarabun New" w:hAnsi="TH Sarabun New" w:eastAsia="TH Sarabun New" w:cs="TH Sarabun New"/>
                 <w:color w:val="172333"/>
                 <w:sz w:val="28"/>
                 <w:szCs w:val="28"/>
@@ -14199,7 +14171,7 @@
             </w:pPr>
             <w:r>
               <w:rPr>
-                <w:rFonts w:ascii="TH Sarabun New" w:hAnsi="TH Sarabun New" w:cs="TH Sarabun New"/>
+                <w:rFonts w:ascii="TH Sarabun New" w:hAnsi="TH Sarabun New" w:eastAsia="TH Sarabun New" w:cs="TH Sarabun New"/>
                 <w:color w:val="172333"/>
                 <w:sz w:val="28"/>
                 <w:szCs w:val="28"/>
@@ -14231,7 +14203,7 @@
             </w:pPr>
             <w:r>
               <w:rPr>
-                <w:rFonts w:ascii="TH Sarabun New" w:hAnsi="TH Sarabun New" w:cs="TH Sarabun New"/>
+                <w:rFonts w:ascii="TH Sarabun New" w:hAnsi="TH Sarabun New" w:eastAsia="TH Sarabun New" w:cs="TH Sarabun New"/>
                 <w:color w:val="172333"/>
                 <w:sz w:val="28"/>
                 <w:szCs w:val="28"/>
@@ -14301,7 +14273,7 @@
             </w:pPr>
             <w:r>
               <w:rPr>
-                <w:rFonts w:ascii="TH Sarabun New" w:hAnsi="TH Sarabun New" w:cs="TH Sarabun New"/>
+                <w:rFonts w:ascii="TH Sarabun New" w:hAnsi="TH Sarabun New" w:eastAsia="TH Sarabun New" w:cs="TH Sarabun New"/>
                 <w:color w:val="172333"/>
                 <w:sz w:val="28"/>
                 <w:szCs w:val="28"/>
@@ -14333,7 +14305,7 @@
             </w:pPr>
             <w:r>
               <w:rPr>
-                <w:rFonts w:ascii="TH Sarabun New" w:hAnsi="TH Sarabun New" w:cs="TH Sarabun New"/>
+                <w:rFonts w:ascii="TH Sarabun New" w:hAnsi="TH Sarabun New" w:eastAsia="TH Sarabun New" w:cs="TH Sarabun New"/>
                 <w:color w:val="172333"/>
                 <w:sz w:val="28"/>
                 <w:szCs w:val="28"/>
@@ -14365,7 +14337,7 @@
             </w:pPr>
             <w:r>
               <w:rPr>
-                <w:rFonts w:ascii="TH Sarabun New" w:hAnsi="TH Sarabun New" w:cs="TH Sarabun New"/>
+                <w:rFonts w:ascii="TH Sarabun New" w:hAnsi="TH Sarabun New" w:eastAsia="TH Sarabun New" w:cs="TH Sarabun New"/>
                 <w:color w:val="172333"/>
                 <w:sz w:val="28"/>
                 <w:szCs w:val="28"/>
@@ -14435,7 +14407,7 @@
             </w:pPr>
             <w:r>
               <w:rPr>
-                <w:rFonts w:ascii="TH Sarabun New" w:hAnsi="TH Sarabun New" w:cs="TH Sarabun New"/>
+                <w:rFonts w:ascii="TH Sarabun New" w:hAnsi="TH Sarabun New" w:eastAsia="TH Sarabun New" w:cs="TH Sarabun New"/>
                 <w:color w:val="172333"/>
                 <w:sz w:val="28"/>
                 <w:szCs w:val="28"/>
@@ -14467,7 +14439,7 @@
             </w:pPr>
             <w:r>
               <w:rPr>
-                <w:rFonts w:ascii="TH Sarabun New" w:hAnsi="TH Sarabun New" w:cs="TH Sarabun New"/>
+                <w:rFonts w:ascii="TH Sarabun New" w:hAnsi="TH Sarabun New" w:eastAsia="TH Sarabun New" w:cs="TH Sarabun New"/>
                 <w:color w:val="172333"/>
                 <w:sz w:val="32"/>
                 <w:szCs w:val="32"/>
@@ -14499,7 +14471,7 @@
             </w:pPr>
             <w:r>
               <w:rPr>
-                <w:rFonts w:ascii="TH Sarabun New" w:hAnsi="TH Sarabun New" w:cs="TH Sarabun New"/>
+                <w:rFonts w:ascii="TH Sarabun New" w:hAnsi="TH Sarabun New" w:eastAsia="TH Sarabun New" w:cs="TH Sarabun New"/>
                 <w:color w:val="172333"/>
                 <w:sz w:val="28"/>
                 <w:szCs w:val="28"/>

</xml_diff>